<commit_message>
new report for lesson 1
</commit_message>
<xml_diff>
--- a/Lesson1/Lesson1Report.docx
+++ b/Lesson1/Lesson1Report.docx
@@ -413,7 +413,7 @@
           <w:lang w:val="en-SA"/>
         </w:rPr>
         <w:pict w14:anchorId="4A302E70">
-          <v:rect id="_x0000_i1042" alt="" style="width:468pt;height:.05pt;mso-width-percent:0;mso-height-percent:0;mso-width-percent:0;mso-height-percent:0" o:hralign="center" o:hrstd="t" o:hr="t" fillcolor="#a0a0a0" stroked="f"/>
+          <v:rect id="_x0000_i1040" alt="" style="width:468pt;height:.05pt;mso-width-percent:0;mso-height-percent:0;mso-width-percent:0;mso-height-percent:0" o:hralign="center" o:hrstd="t" o:hr="t" fillcolor="#a0a0a0" stroked="f"/>
         </w:pict>
       </w:r>
     </w:p>
@@ -520,7 +520,7 @@
           <w:lang w:val="en-SA"/>
         </w:rPr>
         <w:pict w14:anchorId="357254A2">
-          <v:rect id="_x0000_i1041" alt="" style="width:468pt;height:.05pt;mso-width-percent:0;mso-height-percent:0;mso-width-percent:0;mso-height-percent:0" o:hralign="center" o:hrstd="t" o:hr="t" fillcolor="#a0a0a0" stroked="f"/>
+          <v:rect id="_x0000_i1039" alt="" style="width:468pt;height:.05pt;mso-width-percent:0;mso-height-percent:0;mso-width-percent:0;mso-height-percent:0" o:hralign="center" o:hrstd="t" o:hr="t" fillcolor="#a0a0a0" stroked="f"/>
         </w:pict>
       </w:r>
     </w:p>
@@ -629,7 +629,25 @@
           <w14:ligatures w14:val="none"/>
         </w:rPr>
         <w:lastRenderedPageBreak/>
-        <w:t>The primary API endpoint used in this demonstration was the /order route, accessed through the API Gateway invoke URL.</w:t>
+        <w:t xml:space="preserve">The primary API endpoint used in this demonstration was the </w:t>
+      </w:r>
+      <w:r>
+        <w:rPr>
+          <w:rFonts w:ascii="Times New Roman" w:eastAsia="Times New Roman" w:hAnsi="Times New Roman" w:cs="Times New Roman"/>
+          <w:kern w:val="0"/>
+          <w:lang w:val="en-SA"/>
+          <w14:ligatures w14:val="none"/>
+        </w:rPr>
+        <w:t>/dvsa</w:t>
+      </w:r>
+      <w:r>
+        <w:rPr>
+          <w:rFonts w:ascii="Times New Roman" w:eastAsia="Times New Roman" w:hAnsi="Times New Roman" w:cs="Times New Roman"/>
+          <w:kern w:val="0"/>
+          <w:lang w:val="en-SA"/>
+          <w14:ligatures w14:val="none"/>
+        </w:rPr>
+        <w:t>/order route, accessed through the API Gateway invoke URL.</w:t>
       </w:r>
     </w:p>
     <w:p>
@@ -753,7 +771,7 @@
           <w:lang w:val="en-SA"/>
         </w:rPr>
         <w:pict w14:anchorId="7E258B70">
-          <v:rect id="_x0000_i1040" alt="" style="width:468pt;height:.05pt;mso-width-percent:0;mso-height-percent:0;mso-width-percent:0;mso-height-percent:0" o:hralign="center" o:hrstd="t" o:hr="t" fillcolor="#a0a0a0" stroked="f"/>
+          <v:rect id="_x0000_i1038" alt="" style="width:468pt;height:.05pt;mso-width-percent:0;mso-height-percent:0;mso-width-percent:0;mso-height-percent:0" o:hralign="center" o:hrstd="t" o:hr="t" fillcolor="#a0a0a0" stroked="f"/>
         </w:pict>
       </w:r>
     </w:p>
@@ -875,7 +893,7 @@
     </w:p>
     <w:p>
       <w:pPr>
-        <w:spacing w:before="100" w:beforeAutospacing="1" w:after="100" w:afterAutospacing="1" w:line="240" w:lineRule="auto"/>
+        <w:spacing w:after="0" w:line="240" w:lineRule="auto"/>
         <w:rPr>
           <w:rFonts w:ascii="Times New Roman" w:eastAsia="Times New Roman" w:hAnsi="Times New Roman" w:cs="Times New Roman"/>
           <w:kern w:val="0"/>
@@ -890,39 +908,42 @@
           <w:lang w:val="en-SA"/>
           <w14:ligatures w14:val="none"/>
         </w:rPr>
-        <w:t>📸</w:t>
-      </w:r>
-      <w:r>
-        <w:rPr>
-          <w:rFonts w:ascii="Times New Roman" w:eastAsia="Times New Roman" w:hAnsi="Times New Roman" w:cs="Times New Roman"/>
-          <w:kern w:val="0"/>
-          <w:lang w:val="en-SA"/>
-          <w14:ligatures w14:val="none"/>
-        </w:rPr>
-        <w:t xml:space="preserve"> </w:t>
-      </w:r>
-      <w:r>
-        <w:rPr>
-          <w:rFonts w:ascii="Times New Roman" w:eastAsia="Times New Roman" w:hAnsi="Times New Roman" w:cs="Times New Roman"/>
-          <w:b/>
-          <w:bCs/>
-          <w:kern w:val="0"/>
-          <w:lang w:val="en-SA"/>
-          <w14:ligatures w14:val="none"/>
-        </w:rPr>
-        <w:t>[Screenshot Placeholder 1: Postman showing normal request and successful response]</w:t>
-      </w:r>
-    </w:p>
-    <w:p>
-      <w:pPr>
-        <w:spacing w:after="0" w:line="240" w:lineRule="auto"/>
-        <w:rPr>
-          <w:rFonts w:ascii="Times New Roman" w:eastAsia="Times New Roman" w:hAnsi="Times New Roman" w:cs="Times New Roman"/>
-          <w:kern w:val="0"/>
-          <w:lang w:val="en-SA"/>
-          <w14:ligatures w14:val="none"/>
-        </w:rPr>
-      </w:pPr>
+        <w:drawing>
+          <wp:inline distT="0" distB="0" distL="0" distR="0" wp14:anchorId="06CAAB0C" wp14:editId="6F709B83">
+            <wp:extent cx="5943600" cy="3202305"/>
+            <wp:effectExtent l="0" t="0" r="0" b="0"/>
+            <wp:docPr id="1578947870" name="Picture 1"/>
+            <wp:cNvGraphicFramePr>
+              <a:graphicFrameLocks xmlns:a="http://schemas.openxmlformats.org/drawingml/2006/main" noChangeAspect="1"/>
+            </wp:cNvGraphicFramePr>
+            <a:graphic xmlns:a="http://schemas.openxmlformats.org/drawingml/2006/main">
+              <a:graphicData uri="http://schemas.openxmlformats.org/drawingml/2006/picture">
+                <pic:pic xmlns:pic="http://schemas.openxmlformats.org/drawingml/2006/picture">
+                  <pic:nvPicPr>
+                    <pic:cNvPr id="1578947870" name=""/>
+                    <pic:cNvPicPr/>
+                  </pic:nvPicPr>
+                  <pic:blipFill>
+                    <a:blip r:embed="rId8"/>
+                    <a:stretch>
+                      <a:fillRect/>
+                    </a:stretch>
+                  </pic:blipFill>
+                  <pic:spPr>
+                    <a:xfrm>
+                      <a:off x="0" y="0"/>
+                      <a:ext cx="5943600" cy="3202305"/>
+                    </a:xfrm>
+                    <a:prstGeom prst="rect">
+                      <a:avLst/>
+                    </a:prstGeom>
+                  </pic:spPr>
+                </pic:pic>
+              </a:graphicData>
+            </a:graphic>
+          </wp:inline>
+        </w:drawing>
+      </w:r>
       <w:r>
         <w:rPr>
           <w:rFonts w:ascii="Times New Roman" w:eastAsia="Times New Roman" w:hAnsi="Times New Roman" w:cs="Times New Roman"/>
@@ -931,304 +952,6 @@
           <w:lang w:val="en-SA"/>
         </w:rPr>
         <w:pict w14:anchorId="0163378F">
-          <v:rect id="_x0000_i1039" alt="" style="width:468pt;height:.05pt;mso-width-percent:0;mso-height-percent:0;mso-width-percent:0;mso-height-percent:0" o:hralign="center" o:hrstd="t" o:hr="t" fillcolor="#a0a0a0" stroked="f"/>
-        </w:pict>
-      </w:r>
-    </w:p>
-    <w:p>
-      <w:pPr>
-        <w:spacing w:before="100" w:beforeAutospacing="1" w:after="100" w:afterAutospacing="1" w:line="240" w:lineRule="auto"/>
-        <w:rPr>
-          <w:rFonts w:ascii="Times New Roman" w:eastAsia="Times New Roman" w:hAnsi="Times New Roman" w:cs="Times New Roman"/>
-          <w:kern w:val="0"/>
-          <w:lang w:val="en-SA"/>
-          <w14:ligatures w14:val="none"/>
-        </w:rPr>
-      </w:pPr>
-      <w:r>
-        <w:rPr>
-          <w:rFonts w:ascii="Times New Roman" w:eastAsia="Times New Roman" w:hAnsi="Times New Roman" w:cs="Times New Roman"/>
-          <w:kern w:val="0"/>
-          <w:lang w:val="en-SA"/>
-          <w14:ligatures w14:val="none"/>
-        </w:rPr>
-        <w:t>Next, the attacker modifies the request by injecting a malicious serialized payload into an additional field:</w:t>
-      </w:r>
-    </w:p>
-    <w:p>
-      <w:pPr>
-        <w:spacing w:before="100" w:beforeAutospacing="1" w:after="100" w:afterAutospacing="1" w:line="240" w:lineRule="auto"/>
-        <w:rPr>
-          <w:rFonts w:ascii="Times New Roman" w:eastAsia="Times New Roman" w:hAnsi="Times New Roman" w:cs="Times New Roman"/>
-          <w:kern w:val="0"/>
-          <w:lang w:val="en-SA"/>
-          <w14:ligatures w14:val="none"/>
-        </w:rPr>
-      </w:pPr>
-      <w:r>
-        <w:rPr>
-          <w:rFonts w:ascii="Times New Roman" w:eastAsia="Times New Roman" w:hAnsi="Times New Roman" w:cs="Times New Roman"/>
-          <w:kern w:val="0"/>
-          <w:lang w:val="en-SA"/>
-          <w14:ligatures w14:val="none"/>
-        </w:rPr>
-        <w:t>{</w:t>
-      </w:r>
-    </w:p>
-    <w:p>
-      <w:pPr>
-        <w:spacing w:before="100" w:beforeAutospacing="1" w:after="100" w:afterAutospacing="1" w:line="240" w:lineRule="auto"/>
-        <w:rPr>
-          <w:rFonts w:ascii="Times New Roman" w:eastAsia="Times New Roman" w:hAnsi="Times New Roman" w:cs="Times New Roman"/>
-          <w:kern w:val="0"/>
-          <w:lang w:val="en-SA"/>
-          <w14:ligatures w14:val="none"/>
-        </w:rPr>
-      </w:pPr>
-      <w:r>
-        <w:rPr>
-          <w:rFonts w:ascii="Times New Roman" w:eastAsia="Times New Roman" w:hAnsi="Times New Roman" w:cs="Times New Roman"/>
-          <w:kern w:val="0"/>
-          <w:lang w:val="en-SA"/>
-          <w14:ligatures w14:val="none"/>
-        </w:rPr>
-        <w:t>“action”: “orders”,</w:t>
-      </w:r>
-    </w:p>
-    <w:p>
-      <w:pPr>
-        <w:spacing w:before="100" w:beforeAutospacing="1" w:after="100" w:afterAutospacing="1" w:line="240" w:lineRule="auto"/>
-        <w:rPr>
-          <w:rFonts w:ascii="Times New Roman" w:eastAsia="Times New Roman" w:hAnsi="Times New Roman" w:cs="Times New Roman"/>
-          <w:kern w:val="0"/>
-          <w:lang w:val="en-SA"/>
-          <w14:ligatures w14:val="none"/>
-        </w:rPr>
-      </w:pPr>
-      <w:r>
-        <w:rPr>
-          <w:rFonts w:ascii="Times New Roman" w:eastAsia="Times New Roman" w:hAnsi="Times New Roman" w:cs="Times New Roman"/>
-          <w:kern w:val="0"/>
-          <w:lang w:val="en-SA"/>
-          <w14:ligatures w14:val="none"/>
-        </w:rPr>
-        <w:t>“test”: “_$$ND_FUNC$$_function(){throw ‘INJECTEDbyMK’}()”</w:t>
-      </w:r>
-    </w:p>
-    <w:p>
-      <w:pPr>
-        <w:spacing w:before="100" w:beforeAutospacing="1" w:after="100" w:afterAutospacing="1" w:line="240" w:lineRule="auto"/>
-        <w:rPr>
-          <w:rFonts w:ascii="Times New Roman" w:eastAsia="Times New Roman" w:hAnsi="Times New Roman" w:cs="Times New Roman"/>
-          <w:kern w:val="0"/>
-          <w:lang w:val="en-SA"/>
-          <w14:ligatures w14:val="none"/>
-        </w:rPr>
-      </w:pPr>
-      <w:r>
-        <w:rPr>
-          <w:rFonts w:ascii="Times New Roman" w:eastAsia="Times New Roman" w:hAnsi="Times New Roman" w:cs="Times New Roman"/>
-          <w:kern w:val="0"/>
-          <w:lang w:val="en-SA"/>
-          <w14:ligatures w14:val="none"/>
-        </w:rPr>
-        <w:t>}</w:t>
-      </w:r>
-    </w:p>
-    <w:p>
-      <w:pPr>
-        <w:spacing w:before="100" w:beforeAutospacing="1" w:after="100" w:afterAutospacing="1" w:line="240" w:lineRule="auto"/>
-        <w:rPr>
-          <w:rFonts w:ascii="Times New Roman" w:eastAsia="Times New Roman" w:hAnsi="Times New Roman" w:cs="Times New Roman"/>
-          <w:kern w:val="0"/>
-          <w:lang w:val="en-SA"/>
-          <w14:ligatures w14:val="none"/>
-        </w:rPr>
-      </w:pPr>
-    </w:p>
-    <w:p>
-      <w:pPr>
-        <w:spacing w:before="100" w:beforeAutospacing="1" w:after="100" w:afterAutospacing="1" w:line="240" w:lineRule="auto"/>
-        <w:rPr>
-          <w:rFonts w:ascii="Times New Roman" w:eastAsia="Times New Roman" w:hAnsi="Times New Roman" w:cs="Times New Roman"/>
-          <w:kern w:val="0"/>
-          <w:lang w:val="en-SA"/>
-          <w14:ligatures w14:val="none"/>
-        </w:rPr>
-      </w:pPr>
-      <w:r>
-        <w:rPr>
-          <w:rFonts w:ascii="Apple Color Emoji" w:eastAsia="Times New Roman" w:hAnsi="Apple Color Emoji" w:cs="Apple Color Emoji"/>
-          <w:kern w:val="0"/>
-          <w:lang w:val="en-SA"/>
-          <w14:ligatures w14:val="none"/>
-        </w:rPr>
-        <w:t>📸</w:t>
-      </w:r>
-      <w:r>
-        <w:rPr>
-          <w:rFonts w:ascii="Times New Roman" w:eastAsia="Times New Roman" w:hAnsi="Times New Roman" w:cs="Times New Roman"/>
-          <w:kern w:val="0"/>
-          <w:lang w:val="en-SA"/>
-          <w14:ligatures w14:val="none"/>
-        </w:rPr>
-        <w:t xml:space="preserve"> </w:t>
-      </w:r>
-      <w:r>
-        <w:rPr>
-          <w:rFonts w:ascii="Times New Roman" w:eastAsia="Times New Roman" w:hAnsi="Times New Roman" w:cs="Times New Roman"/>
-          <w:b/>
-          <w:bCs/>
-          <w:kern w:val="0"/>
-          <w:lang w:val="en-SA"/>
-          <w14:ligatures w14:val="none"/>
-        </w:rPr>
-        <w:t>[Screenshot Placeholder 2: Postman showing crafted malicious payload before sending request]</w:t>
-      </w:r>
-    </w:p>
-    <w:p>
-      <w:pPr>
-        <w:spacing w:after="0" w:line="240" w:lineRule="auto"/>
-        <w:rPr>
-          <w:rFonts w:ascii="Times New Roman" w:eastAsia="Times New Roman" w:hAnsi="Times New Roman" w:cs="Times New Roman"/>
-          <w:kern w:val="0"/>
-          <w:lang w:val="en-SA"/>
-          <w14:ligatures w14:val="none"/>
-        </w:rPr>
-      </w:pPr>
-      <w:r>
-        <w:rPr>
-          <w:rFonts w:ascii="Times New Roman" w:eastAsia="Times New Roman" w:hAnsi="Times New Roman" w:cs="Times New Roman"/>
-          <w:noProof/>
-          <w:kern w:val="0"/>
-          <w:lang w:val="en-SA"/>
-        </w:rPr>
-        <w:lastRenderedPageBreak/>
-        <w:pict w14:anchorId="565723C4">
-          <v:rect id="_x0000_i1038" alt="" style="width:468pt;height:.05pt;mso-width-percent:0;mso-height-percent:0;mso-width-percent:0;mso-height-percent:0" o:hralign="center" o:hrstd="t" o:hr="t" fillcolor="#a0a0a0" stroked="f"/>
-        </w:pict>
-      </w:r>
-    </w:p>
-    <w:p>
-      <w:pPr>
-        <w:spacing w:before="100" w:beforeAutospacing="1" w:after="100" w:afterAutospacing="1" w:line="240" w:lineRule="auto"/>
-        <w:rPr>
-          <w:rFonts w:ascii="Times New Roman" w:eastAsia="Times New Roman" w:hAnsi="Times New Roman" w:cs="Times New Roman"/>
-          <w:kern w:val="0"/>
-          <w:lang w:val="en-SA"/>
-          <w14:ligatures w14:val="none"/>
-        </w:rPr>
-      </w:pPr>
-      <w:r>
-        <w:rPr>
-          <w:rFonts w:ascii="Times New Roman" w:eastAsia="Times New Roman" w:hAnsi="Times New Roman" w:cs="Times New Roman"/>
-          <w:kern w:val="0"/>
-          <w:lang w:val="en-SA"/>
-          <w14:ligatures w14:val="none"/>
-        </w:rPr>
-        <w:t>The attacker sends this crafted request to the same API endpoint using Postman.</w:t>
-      </w:r>
-    </w:p>
-    <w:p>
-      <w:pPr>
-        <w:spacing w:before="100" w:beforeAutospacing="1" w:after="100" w:afterAutospacing="1" w:line="240" w:lineRule="auto"/>
-        <w:rPr>
-          <w:rFonts w:ascii="Times New Roman" w:eastAsia="Times New Roman" w:hAnsi="Times New Roman" w:cs="Times New Roman"/>
-          <w:kern w:val="0"/>
-          <w:lang w:val="en-SA"/>
-          <w14:ligatures w14:val="none"/>
-        </w:rPr>
-      </w:pPr>
-    </w:p>
-    <w:p>
-      <w:pPr>
-        <w:spacing w:before="100" w:beforeAutospacing="1" w:after="100" w:afterAutospacing="1" w:line="240" w:lineRule="auto"/>
-        <w:rPr>
-          <w:rFonts w:ascii="Times New Roman" w:eastAsia="Times New Roman" w:hAnsi="Times New Roman" w:cs="Times New Roman"/>
-          <w:kern w:val="0"/>
-          <w:lang w:val="en-SA"/>
-          <w14:ligatures w14:val="none"/>
-        </w:rPr>
-      </w:pPr>
-      <w:r>
-        <w:rPr>
-          <w:rFonts w:ascii="Times New Roman" w:eastAsia="Times New Roman" w:hAnsi="Times New Roman" w:cs="Times New Roman"/>
-          <w:kern w:val="0"/>
-          <w:lang w:val="en-SA"/>
-          <w14:ligatures w14:val="none"/>
-        </w:rPr>
-        <w:t>After sending the request, the API returns a 502 Bad Gateway error, indicating that the backend Lambda function encountered an internal failure.</w:t>
-      </w:r>
-    </w:p>
-    <w:p>
-      <w:pPr>
-        <w:spacing w:before="100" w:beforeAutospacing="1" w:after="100" w:afterAutospacing="1" w:line="240" w:lineRule="auto"/>
-        <w:rPr>
-          <w:rFonts w:ascii="Times New Roman" w:eastAsia="Times New Roman" w:hAnsi="Times New Roman" w:cs="Times New Roman"/>
-          <w:kern w:val="0"/>
-          <w:lang w:val="en-SA"/>
-          <w14:ligatures w14:val="none"/>
-        </w:rPr>
-      </w:pPr>
-    </w:p>
-    <w:p>
-      <w:pPr>
-        <w:spacing w:before="100" w:beforeAutospacing="1" w:after="100" w:afterAutospacing="1" w:line="240" w:lineRule="auto"/>
-        <w:rPr>
-          <w:rFonts w:ascii="Times New Roman" w:eastAsia="Times New Roman" w:hAnsi="Times New Roman" w:cs="Times New Roman"/>
-          <w:kern w:val="0"/>
-          <w:lang w:val="en-SA"/>
-          <w14:ligatures w14:val="none"/>
-        </w:rPr>
-      </w:pPr>
-      <w:r>
-        <w:rPr>
-          <w:rFonts w:ascii="Apple Color Emoji" w:eastAsia="Times New Roman" w:hAnsi="Apple Color Emoji" w:cs="Apple Color Emoji"/>
-          <w:kern w:val="0"/>
-          <w:lang w:val="en-SA"/>
-          <w14:ligatures w14:val="none"/>
-        </w:rPr>
-        <w:t>📸</w:t>
-      </w:r>
-      <w:r>
-        <w:rPr>
-          <w:rFonts w:ascii="Times New Roman" w:eastAsia="Times New Roman" w:hAnsi="Times New Roman" w:cs="Times New Roman"/>
-          <w:kern w:val="0"/>
-          <w:lang w:val="en-SA"/>
-          <w14:ligatures w14:val="none"/>
-        </w:rPr>
-        <w:t xml:space="preserve"> </w:t>
-      </w:r>
-      <w:r>
-        <w:rPr>
-          <w:rFonts w:ascii="Times New Roman" w:eastAsia="Times New Roman" w:hAnsi="Times New Roman" w:cs="Times New Roman"/>
-          <w:b/>
-          <w:bCs/>
-          <w:kern w:val="0"/>
-          <w:lang w:val="en-SA"/>
-          <w14:ligatures w14:val="none"/>
-        </w:rPr>
-        <w:t>[Screenshot Placeholder 3: Postman response showing 502 Bad Gateway / Internal server error]</w:t>
-      </w:r>
-    </w:p>
-    <w:p>
-      <w:pPr>
-        <w:spacing w:after="0" w:line="240" w:lineRule="auto"/>
-        <w:rPr>
-          <w:rFonts w:ascii="Times New Roman" w:eastAsia="Times New Roman" w:hAnsi="Times New Roman" w:cs="Times New Roman"/>
-          <w:kern w:val="0"/>
-          <w:lang w:val="en-SA"/>
-          <w14:ligatures w14:val="none"/>
-        </w:rPr>
-      </w:pPr>
-      <w:r>
-        <w:rPr>
-          <w:rFonts w:ascii="Times New Roman" w:eastAsia="Times New Roman" w:hAnsi="Times New Roman" w:cs="Times New Roman"/>
-          <w:noProof/>
-          <w:kern w:val="0"/>
-          <w:lang w:val="en-SA"/>
-        </w:rPr>
-        <w:pict w14:anchorId="68040698">
           <v:rect id="_x0000_i1037" alt="" style="width:468pt;height:.05pt;mso-width-percent:0;mso-height-percent:0;mso-width-percent:0;mso-height-percent:0" o:hralign="center" o:hrstd="t" o:hr="t" fillcolor="#a0a0a0" stroked="f"/>
         </w:pict>
       </w:r>
@@ -1250,6 +973,287 @@
           <w:lang w:val="en-SA"/>
           <w14:ligatures w14:val="none"/>
         </w:rPr>
+        <w:lastRenderedPageBreak/>
+        <w:t>Next, the attacker modifies the request by injecting a malicious serialized payload into an additional field:</w:t>
+      </w:r>
+    </w:p>
+    <w:p>
+      <w:pPr>
+        <w:spacing w:before="100" w:beforeAutospacing="1" w:after="100" w:afterAutospacing="1" w:line="240" w:lineRule="auto"/>
+        <w:rPr>
+          <w:rFonts w:ascii="Times New Roman" w:eastAsia="Times New Roman" w:hAnsi="Times New Roman" w:cs="Times New Roman"/>
+          <w:kern w:val="0"/>
+          <w:lang w:val="en-SA"/>
+          <w14:ligatures w14:val="none"/>
+        </w:rPr>
+      </w:pPr>
+      <w:r>
+        <w:rPr>
+          <w:rFonts w:ascii="Times New Roman" w:eastAsia="Times New Roman" w:hAnsi="Times New Roman" w:cs="Times New Roman"/>
+          <w:kern w:val="0"/>
+          <w:lang w:val="en-SA"/>
+          <w14:ligatures w14:val="none"/>
+        </w:rPr>
+        <w:t>{</w:t>
+      </w:r>
+    </w:p>
+    <w:p>
+      <w:pPr>
+        <w:spacing w:before="100" w:beforeAutospacing="1" w:after="100" w:afterAutospacing="1" w:line="240" w:lineRule="auto"/>
+        <w:rPr>
+          <w:rFonts w:ascii="Times New Roman" w:eastAsia="Times New Roman" w:hAnsi="Times New Roman" w:cs="Times New Roman"/>
+          <w:kern w:val="0"/>
+          <w:lang w:val="en-SA"/>
+          <w14:ligatures w14:val="none"/>
+        </w:rPr>
+      </w:pPr>
+      <w:r>
+        <w:rPr>
+          <w:rFonts w:ascii="Times New Roman" w:eastAsia="Times New Roman" w:hAnsi="Times New Roman" w:cs="Times New Roman"/>
+          <w:kern w:val="0"/>
+          <w:lang w:val="en-SA"/>
+          <w14:ligatures w14:val="none"/>
+        </w:rPr>
+        <w:t>“action”: “orders”,</w:t>
+      </w:r>
+    </w:p>
+    <w:p>
+      <w:pPr>
+        <w:spacing w:before="100" w:beforeAutospacing="1" w:after="100" w:afterAutospacing="1" w:line="240" w:lineRule="auto"/>
+        <w:rPr>
+          <w:rFonts w:ascii="Times New Roman" w:eastAsia="Times New Roman" w:hAnsi="Times New Roman" w:cs="Times New Roman"/>
+          <w:kern w:val="0"/>
+          <w:lang w:val="en-SA"/>
+          <w14:ligatures w14:val="none"/>
+        </w:rPr>
+      </w:pPr>
+      <w:r>
+        <w:rPr>
+          <w:rFonts w:ascii="Times New Roman" w:eastAsia="Times New Roman" w:hAnsi="Times New Roman" w:cs="Times New Roman"/>
+          <w:kern w:val="0"/>
+          <w:lang w:val="en-SA"/>
+          <w14:ligatures w14:val="none"/>
+        </w:rPr>
+        <w:t>“test”: “_$$ND_FUNC$$_function(){throw ‘INJECTEDbyMK’}()”</w:t>
+      </w:r>
+    </w:p>
+    <w:p>
+      <w:pPr>
+        <w:spacing w:before="100" w:beforeAutospacing="1" w:after="100" w:afterAutospacing="1" w:line="240" w:lineRule="auto"/>
+        <w:rPr>
+          <w:rFonts w:ascii="Times New Roman" w:eastAsia="Times New Roman" w:hAnsi="Times New Roman" w:cs="Times New Roman"/>
+          <w:kern w:val="0"/>
+          <w:lang w:val="en-SA"/>
+          <w14:ligatures w14:val="none"/>
+        </w:rPr>
+      </w:pPr>
+      <w:r>
+        <w:rPr>
+          <w:rFonts w:ascii="Times New Roman" w:eastAsia="Times New Roman" w:hAnsi="Times New Roman" w:cs="Times New Roman"/>
+          <w:kern w:val="0"/>
+          <w:lang w:val="en-SA"/>
+          <w14:ligatures w14:val="none"/>
+        </w:rPr>
+        <w:t>}</w:t>
+      </w:r>
+    </w:p>
+    <w:p>
+      <w:pPr>
+        <w:spacing w:after="0" w:line="240" w:lineRule="auto"/>
+        <w:rPr>
+          <w:rFonts w:ascii="Times New Roman" w:eastAsia="Times New Roman" w:hAnsi="Times New Roman" w:cs="Times New Roman"/>
+          <w:kern w:val="0"/>
+          <w:lang w:val="en-SA"/>
+          <w14:ligatures w14:val="none"/>
+        </w:rPr>
+      </w:pPr>
+      <w:r>
+        <w:rPr>
+          <w:rFonts w:ascii="Apple Color Emoji" w:eastAsia="Times New Roman" w:hAnsi="Apple Color Emoji" w:cs="Apple Color Emoji"/>
+          <w:kern w:val="0"/>
+          <w:lang w:val="en-SA"/>
+          <w14:ligatures w14:val="none"/>
+        </w:rPr>
+        <w:drawing>
+          <wp:inline distT="0" distB="0" distL="0" distR="0" wp14:anchorId="0A4DE8A7" wp14:editId="29BF970E">
+            <wp:extent cx="5943600" cy="1384300"/>
+            <wp:effectExtent l="0" t="0" r="0" b="0"/>
+            <wp:docPr id="236155252" name="Picture 1" descr="A screenshot of a computer&#10;&#10;AI-generated content may be incorrect."/>
+            <wp:cNvGraphicFramePr>
+              <a:graphicFrameLocks xmlns:a="http://schemas.openxmlformats.org/drawingml/2006/main" noChangeAspect="1"/>
+            </wp:cNvGraphicFramePr>
+            <a:graphic xmlns:a="http://schemas.openxmlformats.org/drawingml/2006/main">
+              <a:graphicData uri="http://schemas.openxmlformats.org/drawingml/2006/picture">
+                <pic:pic xmlns:pic="http://schemas.openxmlformats.org/drawingml/2006/picture">
+                  <pic:nvPicPr>
+                    <pic:cNvPr id="236155252" name="Picture 1" descr="A screenshot of a computer&#10;&#10;AI-generated content may be incorrect."/>
+                    <pic:cNvPicPr/>
+                  </pic:nvPicPr>
+                  <pic:blipFill>
+                    <a:blip r:embed="rId9"/>
+                    <a:stretch>
+                      <a:fillRect/>
+                    </a:stretch>
+                  </pic:blipFill>
+                  <pic:spPr>
+                    <a:xfrm>
+                      <a:off x="0" y="0"/>
+                      <a:ext cx="5943600" cy="1384300"/>
+                    </a:xfrm>
+                    <a:prstGeom prst="rect">
+                      <a:avLst/>
+                    </a:prstGeom>
+                  </pic:spPr>
+                </pic:pic>
+              </a:graphicData>
+            </a:graphic>
+          </wp:inline>
+        </w:drawing>
+      </w:r>
+      <w:r>
+        <w:rPr>
+          <w:rFonts w:ascii="Times New Roman" w:eastAsia="Times New Roman" w:hAnsi="Times New Roman" w:cs="Times New Roman"/>
+          <w:noProof/>
+          <w:kern w:val="0"/>
+          <w:lang w:val="en-SA"/>
+        </w:rPr>
+        <w:pict w14:anchorId="565723C4">
+          <v:rect id="_x0000_i1036" alt="" style="width:468pt;height:.05pt;mso-width-percent:0;mso-height-percent:0;mso-width-percent:0;mso-height-percent:0" o:hralign="center" o:hrstd="t" o:hr="t" fillcolor="#a0a0a0" stroked="f"/>
+        </w:pict>
+      </w:r>
+    </w:p>
+    <w:p>
+      <w:pPr>
+        <w:spacing w:before="100" w:beforeAutospacing="1" w:after="100" w:afterAutospacing="1" w:line="240" w:lineRule="auto"/>
+        <w:rPr>
+          <w:rFonts w:ascii="Times New Roman" w:eastAsia="Times New Roman" w:hAnsi="Times New Roman" w:cs="Times New Roman"/>
+          <w:kern w:val="0"/>
+          <w:lang w:val="en-SA"/>
+          <w14:ligatures w14:val="none"/>
+        </w:rPr>
+      </w:pPr>
+      <w:r>
+        <w:rPr>
+          <w:rFonts w:ascii="Times New Roman" w:eastAsia="Times New Roman" w:hAnsi="Times New Roman" w:cs="Times New Roman"/>
+          <w:kern w:val="0"/>
+          <w:lang w:val="en-SA"/>
+          <w14:ligatures w14:val="none"/>
+        </w:rPr>
+        <w:t>The attacker sends this crafted request to the same API endpoint using Postman.</w:t>
+      </w:r>
+      <w:r>
+        <w:rPr>
+          <w:rFonts w:ascii="Times New Roman" w:eastAsia="Times New Roman" w:hAnsi="Times New Roman" w:cs="Times New Roman"/>
+          <w:kern w:val="0"/>
+          <w:lang w:val="en-SA"/>
+          <w14:ligatures w14:val="none"/>
+        </w:rPr>
+        <w:t xml:space="preserve"> </w:t>
+      </w:r>
+      <w:r>
+        <w:rPr>
+          <w:rFonts w:ascii="Times New Roman" w:eastAsia="Times New Roman" w:hAnsi="Times New Roman" w:cs="Times New Roman"/>
+          <w:kern w:val="0"/>
+          <w:lang w:val="en-SA"/>
+          <w14:ligatures w14:val="none"/>
+        </w:rPr>
+        <w:t>After sending the request, the API returns a 502 Bad Gateway error, indicating that the backend Lambda function encountered an internal failure.</w:t>
+      </w:r>
+    </w:p>
+    <w:p>
+      <w:pPr>
+        <w:spacing w:before="100" w:beforeAutospacing="1" w:after="100" w:afterAutospacing="1" w:line="240" w:lineRule="auto"/>
+        <w:rPr>
+          <w:rFonts w:ascii="Times New Roman" w:eastAsia="Times New Roman" w:hAnsi="Times New Roman" w:cs="Times New Roman"/>
+          <w:kern w:val="0"/>
+          <w:lang w:val="en-SA"/>
+          <w14:ligatures w14:val="none"/>
+        </w:rPr>
+      </w:pPr>
+      <w:r>
+        <w:rPr>
+          <w:rFonts w:ascii="Apple Color Emoji" w:eastAsia="Times New Roman" w:hAnsi="Apple Color Emoji" w:cs="Apple Color Emoji"/>
+          <w:kern w:val="0"/>
+          <w:lang w:val="en-SA"/>
+          <w14:ligatures w14:val="none"/>
+        </w:rPr>
+        <w:drawing>
+          <wp:inline distT="0" distB="0" distL="0" distR="0" wp14:anchorId="74F036DF" wp14:editId="1E42A24B">
+            <wp:extent cx="5943600" cy="3186430"/>
+            <wp:effectExtent l="0" t="0" r="0" b="1270"/>
+            <wp:docPr id="139218961" name="Picture 1" descr="A screenshot of a computer&#10;&#10;AI-generated content may be incorrect."/>
+            <wp:cNvGraphicFramePr>
+              <a:graphicFrameLocks xmlns:a="http://schemas.openxmlformats.org/drawingml/2006/main" noChangeAspect="1"/>
+            </wp:cNvGraphicFramePr>
+            <a:graphic xmlns:a="http://schemas.openxmlformats.org/drawingml/2006/main">
+              <a:graphicData uri="http://schemas.openxmlformats.org/drawingml/2006/picture">
+                <pic:pic xmlns:pic="http://schemas.openxmlformats.org/drawingml/2006/picture">
+                  <pic:nvPicPr>
+                    <pic:cNvPr id="139218961" name="Picture 1" descr="A screenshot of a computer&#10;&#10;AI-generated content may be incorrect."/>
+                    <pic:cNvPicPr/>
+                  </pic:nvPicPr>
+                  <pic:blipFill>
+                    <a:blip r:embed="rId10"/>
+                    <a:stretch>
+                      <a:fillRect/>
+                    </a:stretch>
+                  </pic:blipFill>
+                  <pic:spPr>
+                    <a:xfrm>
+                      <a:off x="0" y="0"/>
+                      <a:ext cx="5943600" cy="3186430"/>
+                    </a:xfrm>
+                    <a:prstGeom prst="rect">
+                      <a:avLst/>
+                    </a:prstGeom>
+                  </pic:spPr>
+                </pic:pic>
+              </a:graphicData>
+            </a:graphic>
+          </wp:inline>
+        </w:drawing>
+      </w:r>
+    </w:p>
+    <w:p>
+      <w:pPr>
+        <w:spacing w:after="0" w:line="240" w:lineRule="auto"/>
+        <w:rPr>
+          <w:rFonts w:ascii="Times New Roman" w:eastAsia="Times New Roman" w:hAnsi="Times New Roman" w:cs="Times New Roman"/>
+          <w:kern w:val="0"/>
+          <w:lang w:val="en-SA"/>
+          <w14:ligatures w14:val="none"/>
+        </w:rPr>
+      </w:pPr>
+      <w:r>
+        <w:rPr>
+          <w:rFonts w:ascii="Times New Roman" w:eastAsia="Times New Roman" w:hAnsi="Times New Roman" w:cs="Times New Roman"/>
+          <w:noProof/>
+          <w:kern w:val="0"/>
+          <w:lang w:val="en-SA"/>
+        </w:rPr>
+        <w:pict w14:anchorId="68040698">
+          <v:rect id="_x0000_i1035" alt="" style="width:468pt;height:.05pt;mso-width-percent:0;mso-height-percent:0;mso-width-percent:0;mso-height-percent:0" o:hralign="center" o:hrstd="t" o:hr="t" fillcolor="#a0a0a0" stroked="f"/>
+        </w:pict>
+      </w:r>
+    </w:p>
+    <w:p>
+      <w:pPr>
+        <w:spacing w:before="100" w:beforeAutospacing="1" w:after="100" w:afterAutospacing="1" w:line="240" w:lineRule="auto"/>
+        <w:rPr>
+          <w:rFonts w:ascii="Times New Roman" w:eastAsia="Times New Roman" w:hAnsi="Times New Roman" w:cs="Times New Roman"/>
+          <w:kern w:val="0"/>
+          <w:lang w:val="en-SA"/>
+          <w14:ligatures w14:val="none"/>
+        </w:rPr>
+      </w:pPr>
+      <w:r>
+        <w:rPr>
+          <w:rFonts w:ascii="Times New Roman" w:eastAsia="Times New Roman" w:hAnsi="Times New Roman" w:cs="Times New Roman"/>
+          <w:kern w:val="0"/>
+          <w:lang w:val="en-SA"/>
+          <w14:ligatures w14:val="none"/>
+        </w:rPr>
+        <w:lastRenderedPageBreak/>
         <w:t>Finally, the attacker checks AWS CloudWatch Logs for the Lambda function handling the request. The logs show that the injected function was executed, and the custom error message INJECTEDbyMK appears in the stack trace.</w:t>
       </w:r>
     </w:p>
@@ -1263,45 +1267,48 @@
           <w14:ligatures w14:val="none"/>
         </w:rPr>
       </w:pPr>
-    </w:p>
-    <w:p>
-      <w:pPr>
-        <w:spacing w:before="100" w:beforeAutospacing="1" w:after="100" w:afterAutospacing="1" w:line="240" w:lineRule="auto"/>
-        <w:rPr>
-          <w:rFonts w:ascii="Times New Roman" w:eastAsia="Times New Roman" w:hAnsi="Times New Roman" w:cs="Times New Roman"/>
-          <w:kern w:val="0"/>
-          <w:lang w:val="en-SA"/>
-          <w14:ligatures w14:val="none"/>
-        </w:rPr>
-      </w:pPr>
-      <w:r>
-        <w:rPr>
-          <w:rFonts w:ascii="Apple Color Emoji" w:eastAsia="Times New Roman" w:hAnsi="Apple Color Emoji" w:cs="Apple Color Emoji"/>
-          <w:kern w:val="0"/>
-          <w:lang w:val="en-SA"/>
-          <w14:ligatures w14:val="none"/>
-        </w:rPr>
-        <w:t>📸</w:t>
-      </w:r>
-      <w:r>
-        <w:rPr>
-          <w:rFonts w:ascii="Times New Roman" w:eastAsia="Times New Roman" w:hAnsi="Times New Roman" w:cs="Times New Roman"/>
-          <w:kern w:val="0"/>
-          <w:lang w:val="en-SA"/>
-          <w14:ligatures w14:val="none"/>
-        </w:rPr>
-        <w:t xml:space="preserve"> </w:t>
-      </w:r>
-      <w:r>
-        <w:rPr>
-          <w:rFonts w:ascii="Times New Roman" w:eastAsia="Times New Roman" w:hAnsi="Times New Roman" w:cs="Times New Roman"/>
-          <w:b/>
-          <w:bCs/>
-          <w:kern w:val="0"/>
-          <w:lang w:val="en-SA"/>
-          <w14:ligatures w14:val="none"/>
-        </w:rPr>
-        <w:t>[Screenshot Placeholder 4: CloudWatch log showing “INJECTEDbyMK” error and stack trace]</w:t>
+      <w:r>
+        <w:rPr>
+          <w:rFonts w:ascii="Times New Roman" w:eastAsia="Times New Roman" w:hAnsi="Times New Roman" w:cs="Times New Roman"/>
+          <w:kern w:val="0"/>
+          <w:lang w:val="en-SA"/>
+          <w14:ligatures w14:val="none"/>
+        </w:rPr>
+        <w:drawing>
+          <wp:inline distT="0" distB="0" distL="0" distR="0" wp14:anchorId="58CB80BF" wp14:editId="39DA4E66">
+            <wp:extent cx="5943600" cy="1449070"/>
+            <wp:effectExtent l="0" t="0" r="0" b="0"/>
+            <wp:docPr id="826810731" name="Picture 1"/>
+            <wp:cNvGraphicFramePr>
+              <a:graphicFrameLocks xmlns:a="http://schemas.openxmlformats.org/drawingml/2006/main" noChangeAspect="1"/>
+            </wp:cNvGraphicFramePr>
+            <a:graphic xmlns:a="http://schemas.openxmlformats.org/drawingml/2006/main">
+              <a:graphicData uri="http://schemas.openxmlformats.org/drawingml/2006/picture">
+                <pic:pic xmlns:pic="http://schemas.openxmlformats.org/drawingml/2006/picture">
+                  <pic:nvPicPr>
+                    <pic:cNvPr id="826810731" name=""/>
+                    <pic:cNvPicPr/>
+                  </pic:nvPicPr>
+                  <pic:blipFill>
+                    <a:blip r:embed="rId11"/>
+                    <a:stretch>
+                      <a:fillRect/>
+                    </a:stretch>
+                  </pic:blipFill>
+                  <pic:spPr>
+                    <a:xfrm>
+                      <a:off x="0" y="0"/>
+                      <a:ext cx="5943600" cy="1449070"/>
+                    </a:xfrm>
+                    <a:prstGeom prst="rect">
+                      <a:avLst/>
+                    </a:prstGeom>
+                  </pic:spPr>
+                </pic:pic>
+              </a:graphicData>
+            </a:graphic>
+          </wp:inline>
+        </w:drawing>
       </w:r>
     </w:p>
     <w:p>
@@ -1322,7 +1329,7 @@
           <w:lang w:val="en-SA"/>
         </w:rPr>
         <w:pict w14:anchorId="7D7DEC34">
-          <v:rect id="_x0000_i1036" alt="" style="width:468pt;height:.05pt;mso-width-percent:0;mso-height-percent:0;mso-width-percent:0;mso-height-percent:0" o:hralign="center" o:hrstd="t" o:hr="t" fillcolor="#a0a0a0" stroked="f"/>
+          <v:rect id="_x0000_i1034" alt="" style="width:468pt;height:.05pt;mso-width-percent:0;mso-height-percent:0;mso-width-percent:0;mso-height-percent:0" o:hralign="center" o:hrstd="t" o:hr="t" fillcolor="#a0a0a0" stroked="f"/>
         </w:pict>
       </w:r>
     </w:p>
@@ -1463,25 +1470,13 @@
           <w14:ligatures w14:val="none"/>
         </w:rPr>
       </w:pPr>
-    </w:p>
-    <w:p>
-      <w:pPr>
-        <w:spacing w:before="100" w:beforeAutospacing="1" w:after="100" w:afterAutospacing="1" w:line="240" w:lineRule="auto"/>
-        <w:rPr>
-          <w:rFonts w:ascii="Times New Roman" w:eastAsia="Times New Roman" w:hAnsi="Times New Roman" w:cs="Times New Roman"/>
-          <w:kern w:val="0"/>
-          <w:lang w:val="en-SA"/>
-          <w14:ligatures w14:val="none"/>
-        </w:rPr>
-      </w:pPr>
-      <w:r>
-        <w:rPr>
-          <w:rFonts w:ascii="Times New Roman" w:eastAsia="Times New Roman" w:hAnsi="Times New Roman" w:cs="Times New Roman"/>
-          <w:kern w:val="0"/>
-          <w:lang w:val="en-SA"/>
-          <w14:ligatures w14:val="none"/>
-        </w:rPr>
-        <w:lastRenderedPageBreak/>
+      <w:r>
+        <w:rPr>
+          <w:rFonts w:ascii="Times New Roman" w:eastAsia="Times New Roman" w:hAnsi="Times New Roman" w:cs="Times New Roman"/>
+          <w:kern w:val="0"/>
+          <w:lang w:val="en-SA"/>
+          <w14:ligatures w14:val="none"/>
+        </w:rPr>
         <w:t>Additionally:</w:t>
       </w:r>
     </w:p>
@@ -1587,28 +1582,15 @@
         </w:rPr>
         <w:t>The exploit is further validated by the fact that the injected payload produced a controlled and predictable error message inside the Lambda execution environment. The appearance of the exact attacker-defined string confirms that the backend interpreted user input as executable code rather than plain data.</w:t>
       </w:r>
-    </w:p>
-    <w:p>
-      <w:pPr>
-        <w:spacing w:before="100" w:beforeAutospacing="1" w:after="100" w:afterAutospacing="1" w:line="240" w:lineRule="auto"/>
-        <w:rPr>
-          <w:rFonts w:ascii="Times New Roman" w:eastAsia="Times New Roman" w:hAnsi="Times New Roman" w:cs="Times New Roman"/>
-          <w:kern w:val="0"/>
-          <w:lang w:val="en-SA"/>
-          <w14:ligatures w14:val="none"/>
-        </w:rPr>
-      </w:pPr>
-    </w:p>
-    <w:p>
-      <w:pPr>
-        <w:spacing w:before="100" w:beforeAutospacing="1" w:after="100" w:afterAutospacing="1" w:line="240" w:lineRule="auto"/>
-        <w:rPr>
-          <w:rFonts w:ascii="Times New Roman" w:eastAsia="Times New Roman" w:hAnsi="Times New Roman" w:cs="Times New Roman"/>
-          <w:kern w:val="0"/>
-          <w:lang w:val="en-SA"/>
-          <w14:ligatures w14:val="none"/>
-        </w:rPr>
-      </w:pPr>
+      <w:r>
+        <w:rPr>
+          <w:rFonts w:ascii="Times New Roman" w:eastAsia="Times New Roman" w:hAnsi="Times New Roman" w:cs="Times New Roman"/>
+          <w:kern w:val="0"/>
+          <w:lang w:val="en-SA"/>
+          <w14:ligatures w14:val="none"/>
+        </w:rPr>
+        <w:t xml:space="preserve"> </w:t>
+      </w:r>
       <w:r>
         <w:rPr>
           <w:rFonts w:ascii="Times New Roman" w:eastAsia="Times New Roman" w:hAnsi="Times New Roman" w:cs="Times New Roman"/>
@@ -1617,28 +1599,6 @@
           <w14:ligatures w14:val="none"/>
         </w:rPr>
         <w:t>This combination of results demonstrates that the backend treats user input as executable content, confirming the presence of an Event Injection vulnerability.</w:t>
-      </w:r>
-    </w:p>
-    <w:p>
-      <w:pPr>
-        <w:spacing w:after="0" w:line="240" w:lineRule="auto"/>
-        <w:rPr>
-          <w:rFonts w:ascii="Times New Roman" w:eastAsia="Times New Roman" w:hAnsi="Times New Roman" w:cs="Times New Roman"/>
-          <w:kern w:val="0"/>
-          <w:lang w:val="en-SA"/>
-          <w14:ligatures w14:val="none"/>
-        </w:rPr>
-      </w:pPr>
-      <w:r>
-        <w:rPr>
-          <w:rFonts w:ascii="Times New Roman" w:eastAsia="Times New Roman" w:hAnsi="Times New Roman" w:cs="Times New Roman"/>
-          <w:noProof/>
-          <w:kern w:val="0"/>
-          <w:lang w:val="en-SA"/>
-        </w:rPr>
-        <w:pict w14:anchorId="62DB71D0">
-          <v:rect id="_x0000_i1035" alt="" style="width:468pt;height:.05pt;mso-width-percent:0;mso-height-percent:0;mso-width-percent:0;mso-height-percent:0" o:hralign="center" o:hrstd="t" o:hr="t" fillcolor="#a0a0a0" stroked="f"/>
-        </w:pict>
       </w:r>
     </w:p>
     <w:p>
@@ -1672,6 +1632,7 @@
           <w:lang w:val="en-SA"/>
           <w14:ligatures w14:val="none"/>
         </w:rPr>
+        <w:lastRenderedPageBreak/>
         <w:t>Fix Strategy / Probable Mitigation</w:t>
       </w:r>
     </w:p>
@@ -1689,6 +1650,7 @@
     <w:p>
       <w:pPr>
         <w:spacing w:before="100" w:beforeAutospacing="1" w:after="100" w:afterAutospacing="1" w:line="240" w:lineRule="auto"/>
+        <w:ind w:firstLine="720"/>
         <w:rPr>
           <w:rFonts w:ascii="Times New Roman" w:eastAsia="Times New Roman" w:hAnsi="Times New Roman" w:cs="Times New Roman"/>
           <w:kern w:val="0"/>
@@ -1709,17 +1671,7 @@
     <w:p>
       <w:pPr>
         <w:spacing w:before="100" w:beforeAutospacing="1" w:after="100" w:afterAutospacing="1" w:line="240" w:lineRule="auto"/>
-        <w:rPr>
-          <w:rFonts w:ascii="Times New Roman" w:eastAsia="Times New Roman" w:hAnsi="Times New Roman" w:cs="Times New Roman"/>
-          <w:kern w:val="0"/>
-          <w:lang w:val="en-SA"/>
-          <w14:ligatures w14:val="none"/>
-        </w:rPr>
-      </w:pPr>
-    </w:p>
-    <w:p>
-      <w:pPr>
-        <w:spacing w:before="100" w:beforeAutospacing="1" w:after="100" w:afterAutospacing="1" w:line="240" w:lineRule="auto"/>
+        <w:ind w:firstLine="720"/>
         <w:rPr>
           <w:rFonts w:ascii="Times New Roman" w:eastAsia="Times New Roman" w:hAnsi="Times New Roman" w:cs="Times New Roman"/>
           <w:kern w:val="0"/>
@@ -1740,17 +1692,7 @@
     <w:p>
       <w:pPr>
         <w:spacing w:before="100" w:beforeAutospacing="1" w:after="100" w:afterAutospacing="1" w:line="240" w:lineRule="auto"/>
-        <w:rPr>
-          <w:rFonts w:ascii="Times New Roman" w:eastAsia="Times New Roman" w:hAnsi="Times New Roman" w:cs="Times New Roman"/>
-          <w:kern w:val="0"/>
-          <w:lang w:val="en-SA"/>
-          <w14:ligatures w14:val="none"/>
-        </w:rPr>
-      </w:pPr>
-    </w:p>
-    <w:p>
-      <w:pPr>
-        <w:spacing w:before="100" w:beforeAutospacing="1" w:after="100" w:afterAutospacing="1" w:line="240" w:lineRule="auto"/>
+        <w:ind w:firstLine="720"/>
         <w:rPr>
           <w:rFonts w:ascii="Times New Roman" w:eastAsia="Times New Roman" w:hAnsi="Times New Roman" w:cs="Times New Roman"/>
           <w:kern w:val="0"/>
@@ -1767,28 +1709,15 @@
         </w:rPr>
         <w:t>The backend should also enforce strict separation between data and executable logic, ensuring that user input cannot influence code execution in any way.</w:t>
       </w:r>
-    </w:p>
-    <w:p>
-      <w:pPr>
-        <w:spacing w:before="100" w:beforeAutospacing="1" w:after="100" w:afterAutospacing="1" w:line="240" w:lineRule="auto"/>
-        <w:rPr>
-          <w:rFonts w:ascii="Times New Roman" w:eastAsia="Times New Roman" w:hAnsi="Times New Roman" w:cs="Times New Roman"/>
-          <w:kern w:val="0"/>
-          <w:lang w:val="en-SA"/>
-          <w14:ligatures w14:val="none"/>
-        </w:rPr>
-      </w:pPr>
-    </w:p>
-    <w:p>
-      <w:pPr>
-        <w:spacing w:before="100" w:beforeAutospacing="1" w:after="100" w:afterAutospacing="1" w:line="240" w:lineRule="auto"/>
-        <w:rPr>
-          <w:rFonts w:ascii="Times New Roman" w:eastAsia="Times New Roman" w:hAnsi="Times New Roman" w:cs="Times New Roman"/>
-          <w:kern w:val="0"/>
-          <w:lang w:val="en-SA"/>
-          <w14:ligatures w14:val="none"/>
-        </w:rPr>
-      </w:pPr>
+      <w:r>
+        <w:rPr>
+          <w:rFonts w:ascii="Times New Roman" w:eastAsia="Times New Roman" w:hAnsi="Times New Roman" w:cs="Times New Roman"/>
+          <w:kern w:val="0"/>
+          <w:lang w:val="en-SA"/>
+          <w14:ligatures w14:val="none"/>
+        </w:rPr>
+        <w:t xml:space="preserve"> </w:t>
+      </w:r>
       <w:r>
         <w:rPr>
           <w:rFonts w:ascii="Times New Roman" w:eastAsia="Times New Roman" w:hAnsi="Times New Roman" w:cs="Times New Roman"/>
@@ -1817,7 +1746,7 @@
           <w:lang w:val="en-SA"/>
         </w:rPr>
         <w:pict w14:anchorId="17AA1A32">
-          <v:rect id="_x0000_i1034" alt="" style="width:468pt;height:.05pt;mso-width-percent:0;mso-height-percent:0;mso-width-percent:0;mso-height-percent:0" o:hralign="center" o:hrstd="t" o:hr="t" fillcolor="#a0a0a0" stroked="f"/>
+          <v:rect id="_x0000_i1033" alt="" style="width:468pt;height:.05pt;mso-width-percent:0;mso-height-percent:0;mso-width-percent:0;mso-height-percent:0" o:hralign="center" o:hrstd="t" o:hr="t" fillcolor="#a0a0a0" stroked="f"/>
         </w:pict>
       </w:r>
     </w:p>
@@ -1852,7 +1781,6 @@
           <w:lang w:val="en-SA"/>
           <w14:ligatures w14:val="none"/>
         </w:rPr>
-        <w:lastRenderedPageBreak/>
         <w:t>Code / Config Changes</w:t>
       </w:r>
     </w:p>
@@ -1928,17 +1856,6 @@
           <w14:ligatures w14:val="none"/>
         </w:rPr>
       </w:pPr>
-    </w:p>
-    <w:p>
-      <w:pPr>
-        <w:spacing w:before="100" w:beforeAutospacing="1" w:after="100" w:afterAutospacing="1" w:line="240" w:lineRule="auto"/>
-        <w:rPr>
-          <w:rFonts w:ascii="Times New Roman" w:eastAsia="Times New Roman" w:hAnsi="Times New Roman" w:cs="Times New Roman"/>
-          <w:kern w:val="0"/>
-          <w:lang w:val="en-SA"/>
-          <w14:ligatures w14:val="none"/>
-        </w:rPr>
-      </w:pPr>
       <w:r>
         <w:rPr>
           <w:rFonts w:ascii="Times New Roman" w:eastAsia="Times New Roman" w:hAnsi="Times New Roman" w:cs="Times New Roman"/>
@@ -1979,17 +1896,6 @@
           <w14:ligatures w14:val="none"/>
         </w:rPr>
       </w:pPr>
-    </w:p>
-    <w:p>
-      <w:pPr>
-        <w:spacing w:before="100" w:beforeAutospacing="1" w:after="100" w:afterAutospacing="1" w:line="240" w:lineRule="auto"/>
-        <w:rPr>
-          <w:rFonts w:ascii="Times New Roman" w:eastAsia="Times New Roman" w:hAnsi="Times New Roman" w:cs="Times New Roman"/>
-          <w:kern w:val="0"/>
-          <w:lang w:val="en-SA"/>
-          <w14:ligatures w14:val="none"/>
-        </w:rPr>
-      </w:pPr>
       <w:r>
         <w:rPr>
           <w:rFonts w:ascii="Apple Color Emoji" w:eastAsia="Times New Roman" w:hAnsi="Apple Color Emoji" w:cs="Apple Color Emoji"/>
@@ -1997,27 +1903,41 @@
           <w:lang w:val="en-SA"/>
           <w14:ligatures w14:val="none"/>
         </w:rPr>
-        <w:t>📸</w:t>
-      </w:r>
-      <w:r>
-        <w:rPr>
-          <w:rFonts w:ascii="Times New Roman" w:eastAsia="Times New Roman" w:hAnsi="Times New Roman" w:cs="Times New Roman"/>
-          <w:kern w:val="0"/>
-          <w:lang w:val="en-SA"/>
-          <w14:ligatures w14:val="none"/>
-        </w:rPr>
-        <w:t xml:space="preserve"> </w:t>
-      </w:r>
-      <w:r>
-        <w:rPr>
-          <w:rFonts w:ascii="Times New Roman" w:eastAsia="Times New Roman" w:hAnsi="Times New Roman" w:cs="Times New Roman"/>
-          <w:b/>
-          <w:bCs/>
-          <w:kern w:val="0"/>
-          <w:lang w:val="en-SA"/>
-          <w14:ligatures w14:val="none"/>
-        </w:rPr>
-        <w:t>[Screenshot Placeholder 5: Code editor showing vulnerable unserialize() usage]</w:t>
+        <w:drawing>
+          <wp:inline distT="0" distB="0" distL="0" distR="0" wp14:anchorId="2FE6C817" wp14:editId="417A7B03">
+            <wp:extent cx="5943600" cy="1264285"/>
+            <wp:effectExtent l="0" t="0" r="0" b="5715"/>
+            <wp:docPr id="1842521131" name="Picture 1"/>
+            <wp:cNvGraphicFramePr>
+              <a:graphicFrameLocks xmlns:a="http://schemas.openxmlformats.org/drawingml/2006/main" noChangeAspect="1"/>
+            </wp:cNvGraphicFramePr>
+            <a:graphic xmlns:a="http://schemas.openxmlformats.org/drawingml/2006/main">
+              <a:graphicData uri="http://schemas.openxmlformats.org/drawingml/2006/picture">
+                <pic:pic xmlns:pic="http://schemas.openxmlformats.org/drawingml/2006/picture">
+                  <pic:nvPicPr>
+                    <pic:cNvPr id="1842521131" name=""/>
+                    <pic:cNvPicPr/>
+                  </pic:nvPicPr>
+                  <pic:blipFill>
+                    <a:blip r:embed="rId12"/>
+                    <a:stretch>
+                      <a:fillRect/>
+                    </a:stretch>
+                  </pic:blipFill>
+                  <pic:spPr>
+                    <a:xfrm>
+                      <a:off x="0" y="0"/>
+                      <a:ext cx="5943600" cy="1264285"/>
+                    </a:xfrm>
+                    <a:prstGeom prst="rect">
+                      <a:avLst/>
+                    </a:prstGeom>
+                  </pic:spPr>
+                </pic:pic>
+              </a:graphicData>
+            </a:graphic>
+          </wp:inline>
+        </w:drawing>
       </w:r>
     </w:p>
     <w:p>
@@ -2038,152 +1958,145 @@
           <w:lang w:val="en-SA"/>
         </w:rPr>
         <w:pict w14:anchorId="73BBBDA3">
-          <v:rect id="_x0000_i1033" alt="" style="width:468pt;height:.05pt;mso-width-percent:0;mso-height-percent:0;mso-width-percent:0;mso-height-percent:0" o:hralign="center" o:hrstd="t" o:hr="t" fillcolor="#a0a0a0" stroked="f"/>
-        </w:pict>
-      </w:r>
-    </w:p>
-    <w:p>
-      <w:pPr>
-        <w:spacing w:before="100" w:beforeAutospacing="1" w:after="100" w:afterAutospacing="1" w:line="240" w:lineRule="auto"/>
-        <w:rPr>
-          <w:rFonts w:ascii="Times New Roman" w:eastAsia="Times New Roman" w:hAnsi="Times New Roman" w:cs="Times New Roman"/>
-          <w:kern w:val="0"/>
-          <w:lang w:val="en-SA"/>
-          <w14:ligatures w14:val="none"/>
-        </w:rPr>
-      </w:pPr>
-      <w:r>
-        <w:rPr>
-          <w:rFonts w:ascii="Times New Roman" w:eastAsia="Times New Roman" w:hAnsi="Times New Roman" w:cs="Times New Roman"/>
-          <w:kern w:val="0"/>
-          <w:lang w:val="en-SA"/>
-          <w14:ligatures w14:val="none"/>
-        </w:rPr>
-        <w:t>After the fix, this logic was replaced with safe JSON parsing:</w:t>
-      </w:r>
-    </w:p>
-    <w:p>
-      <w:pPr>
-        <w:spacing w:before="100" w:beforeAutospacing="1" w:after="100" w:afterAutospacing="1" w:line="240" w:lineRule="auto"/>
-        <w:rPr>
-          <w:rFonts w:ascii="Times New Roman" w:eastAsia="Times New Roman" w:hAnsi="Times New Roman" w:cs="Times New Roman"/>
-          <w:kern w:val="0"/>
-          <w:lang w:val="en-SA"/>
-          <w14:ligatures w14:val="none"/>
-        </w:rPr>
-      </w:pPr>
-    </w:p>
-    <w:p>
-      <w:pPr>
-        <w:spacing w:before="100" w:beforeAutospacing="1" w:after="100" w:afterAutospacing="1" w:line="240" w:lineRule="auto"/>
-        <w:rPr>
-          <w:rFonts w:ascii="Times New Roman" w:eastAsia="Times New Roman" w:hAnsi="Times New Roman" w:cs="Times New Roman"/>
-          <w:kern w:val="0"/>
-          <w:lang w:val="en-SA"/>
-          <w14:ligatures w14:val="none"/>
-        </w:rPr>
-      </w:pPr>
-      <w:r>
-        <w:rPr>
-          <w:rFonts w:ascii="Times New Roman" w:eastAsia="Times New Roman" w:hAnsi="Times New Roman" w:cs="Times New Roman"/>
-          <w:kern w:val="0"/>
-          <w:lang w:val="en-SA"/>
-          <w14:ligatures w14:val="none"/>
-        </w:rPr>
-        <w:t>const req = JSON.parse(event.body || “{}”);</w:t>
-      </w:r>
-    </w:p>
-    <w:p>
-      <w:pPr>
-        <w:spacing w:before="100" w:beforeAutospacing="1" w:after="100" w:afterAutospacing="1" w:line="240" w:lineRule="auto"/>
-        <w:rPr>
-          <w:rFonts w:ascii="Times New Roman" w:eastAsia="Times New Roman" w:hAnsi="Times New Roman" w:cs="Times New Roman"/>
-          <w:kern w:val="0"/>
-          <w:lang w:val="en-SA"/>
-          <w14:ligatures w14:val="none"/>
-        </w:rPr>
-      </w:pPr>
-      <w:r>
-        <w:rPr>
-          <w:rFonts w:ascii="Times New Roman" w:eastAsia="Times New Roman" w:hAnsi="Times New Roman" w:cs="Times New Roman"/>
-          <w:kern w:val="0"/>
-          <w:lang w:val="en-SA"/>
-          <w14:ligatures w14:val="none"/>
-        </w:rPr>
-        <w:t>const headers = event.headers || {};</w:t>
-      </w:r>
-    </w:p>
-    <w:p>
-      <w:pPr>
-        <w:spacing w:before="100" w:beforeAutospacing="1" w:after="100" w:afterAutospacing="1" w:line="240" w:lineRule="auto"/>
-        <w:rPr>
-          <w:rFonts w:ascii="Times New Roman" w:eastAsia="Times New Roman" w:hAnsi="Times New Roman" w:cs="Times New Roman"/>
-          <w:kern w:val="0"/>
-          <w:lang w:val="en-SA"/>
-          <w14:ligatures w14:val="none"/>
-        </w:rPr>
-      </w:pPr>
-    </w:p>
-    <w:p>
-      <w:pPr>
-        <w:spacing w:before="100" w:beforeAutospacing="1" w:after="100" w:afterAutospacing="1" w:line="240" w:lineRule="auto"/>
-        <w:rPr>
-          <w:rFonts w:ascii="Times New Roman" w:eastAsia="Times New Roman" w:hAnsi="Times New Roman" w:cs="Times New Roman"/>
-          <w:kern w:val="0"/>
-          <w:lang w:val="en-SA"/>
-          <w14:ligatures w14:val="none"/>
-        </w:rPr>
-      </w:pPr>
-      <w:r>
-        <w:rPr>
-          <w:rFonts w:ascii="Apple Color Emoji" w:eastAsia="Times New Roman" w:hAnsi="Apple Color Emoji" w:cs="Apple Color Emoji"/>
-          <w:kern w:val="0"/>
-          <w:lang w:val="en-SA"/>
-          <w14:ligatures w14:val="none"/>
-        </w:rPr>
-        <w:t>📸</w:t>
-      </w:r>
-      <w:r>
-        <w:rPr>
-          <w:rFonts w:ascii="Times New Roman" w:eastAsia="Times New Roman" w:hAnsi="Times New Roman" w:cs="Times New Roman"/>
-          <w:kern w:val="0"/>
-          <w:lang w:val="en-SA"/>
-          <w14:ligatures w14:val="none"/>
-        </w:rPr>
-        <w:t xml:space="preserve"> </w:t>
-      </w:r>
-      <w:r>
-        <w:rPr>
-          <w:rFonts w:ascii="Times New Roman" w:eastAsia="Times New Roman" w:hAnsi="Times New Roman" w:cs="Times New Roman"/>
-          <w:b/>
-          <w:bCs/>
-          <w:kern w:val="0"/>
-          <w:lang w:val="en-SA"/>
-          <w14:ligatures w14:val="none"/>
-        </w:rPr>
-        <w:t>[Screenshot Placeholder 6: Code editor showing fixed JSON.parse implementation]</w:t>
-      </w:r>
-    </w:p>
-    <w:p>
-      <w:pPr>
-        <w:spacing w:after="0" w:line="240" w:lineRule="auto"/>
-        <w:rPr>
-          <w:rFonts w:ascii="Times New Roman" w:eastAsia="Times New Roman" w:hAnsi="Times New Roman" w:cs="Times New Roman"/>
-          <w:kern w:val="0"/>
-          <w:lang w:val="en-SA"/>
-          <w14:ligatures w14:val="none"/>
-        </w:rPr>
-      </w:pPr>
-      <w:r>
-        <w:rPr>
-          <w:rFonts w:ascii="Times New Roman" w:eastAsia="Times New Roman" w:hAnsi="Times New Roman" w:cs="Times New Roman"/>
-          <w:noProof/>
-          <w:kern w:val="0"/>
-          <w:lang w:val="en-SA"/>
-        </w:rPr>
-        <w:pict w14:anchorId="04670F61">
           <v:rect id="_x0000_i1032" alt="" style="width:468pt;height:.05pt;mso-width-percent:0;mso-height-percent:0;mso-width-percent:0;mso-height-percent:0" o:hralign="center" o:hrstd="t" o:hr="t" fillcolor="#a0a0a0" stroked="f"/>
         </w:pict>
+      </w:r>
+    </w:p>
+    <w:p>
+      <w:pPr>
+        <w:spacing w:before="100" w:beforeAutospacing="1" w:after="100" w:afterAutospacing="1" w:line="240" w:lineRule="auto"/>
+        <w:rPr>
+          <w:rFonts w:ascii="Times New Roman" w:eastAsia="Times New Roman" w:hAnsi="Times New Roman" w:cs="Times New Roman"/>
+          <w:kern w:val="0"/>
+          <w:lang w:val="en-SA"/>
+          <w14:ligatures w14:val="none"/>
+        </w:rPr>
+      </w:pPr>
+    </w:p>
+    <w:p>
+      <w:pPr>
+        <w:spacing w:before="100" w:beforeAutospacing="1" w:after="100" w:afterAutospacing="1" w:line="240" w:lineRule="auto"/>
+        <w:rPr>
+          <w:rFonts w:ascii="Times New Roman" w:eastAsia="Times New Roman" w:hAnsi="Times New Roman" w:cs="Times New Roman"/>
+          <w:kern w:val="0"/>
+          <w:lang w:val="en-SA"/>
+          <w14:ligatures w14:val="none"/>
+        </w:rPr>
+      </w:pPr>
+      <w:r>
+        <w:rPr>
+          <w:rFonts w:ascii="Times New Roman" w:eastAsia="Times New Roman" w:hAnsi="Times New Roman" w:cs="Times New Roman"/>
+          <w:kern w:val="0"/>
+          <w:lang w:val="en-SA"/>
+          <w14:ligatures w14:val="none"/>
+        </w:rPr>
+        <w:lastRenderedPageBreak/>
+        <w:t>After the fix, this logic was replaced with safe JSON parsing:</w:t>
+      </w:r>
+    </w:p>
+    <w:p>
+      <w:pPr>
+        <w:spacing w:before="100" w:beforeAutospacing="1" w:after="100" w:afterAutospacing="1" w:line="240" w:lineRule="auto"/>
+        <w:rPr>
+          <w:rFonts w:ascii="Times New Roman" w:eastAsia="Times New Roman" w:hAnsi="Times New Roman" w:cs="Times New Roman"/>
+          <w:kern w:val="0"/>
+          <w:lang w:val="en-SA"/>
+          <w14:ligatures w14:val="none"/>
+        </w:rPr>
+      </w:pPr>
+      <w:r>
+        <w:rPr>
+          <w:rFonts w:ascii="Times New Roman" w:eastAsia="Times New Roman" w:hAnsi="Times New Roman" w:cs="Times New Roman"/>
+          <w:kern w:val="0"/>
+          <w:lang w:val="en-SA"/>
+          <w14:ligatures w14:val="none"/>
+        </w:rPr>
+        <w:t>const req = JSON.parse(event.body || “{}”);</w:t>
+      </w:r>
+    </w:p>
+    <w:p>
+      <w:pPr>
+        <w:spacing w:before="100" w:beforeAutospacing="1" w:after="100" w:afterAutospacing="1" w:line="240" w:lineRule="auto"/>
+        <w:rPr>
+          <w:rFonts w:ascii="Times New Roman" w:eastAsia="Times New Roman" w:hAnsi="Times New Roman" w:cs="Times New Roman"/>
+          <w:kern w:val="0"/>
+          <w:lang w:val="en-SA"/>
+          <w14:ligatures w14:val="none"/>
+        </w:rPr>
+      </w:pPr>
+      <w:r>
+        <w:rPr>
+          <w:rFonts w:ascii="Times New Roman" w:eastAsia="Times New Roman" w:hAnsi="Times New Roman" w:cs="Times New Roman"/>
+          <w:kern w:val="0"/>
+          <w:lang w:val="en-SA"/>
+          <w14:ligatures w14:val="none"/>
+        </w:rPr>
+        <w:t>const headers = event.headers || {};</w:t>
+      </w:r>
+    </w:p>
+    <w:p>
+      <w:pPr>
+        <w:spacing w:before="100" w:beforeAutospacing="1" w:after="100" w:afterAutospacing="1" w:line="240" w:lineRule="auto"/>
+        <w:rPr>
+          <w:rFonts w:ascii="Times New Roman" w:eastAsia="Times New Roman" w:hAnsi="Times New Roman" w:cs="Times New Roman"/>
+          <w:kern w:val="0"/>
+          <w:lang w:val="en-SA"/>
+          <w14:ligatures w14:val="none"/>
+        </w:rPr>
+      </w:pPr>
+    </w:p>
+    <w:p>
+      <w:pPr>
+        <w:spacing w:after="0" w:line="240" w:lineRule="auto"/>
+        <w:rPr>
+          <w:rFonts w:ascii="Times New Roman" w:eastAsia="Times New Roman" w:hAnsi="Times New Roman" w:cs="Times New Roman"/>
+          <w:kern w:val="0"/>
+          <w:lang w:val="en-SA"/>
+          <w14:ligatures w14:val="none"/>
+        </w:rPr>
+      </w:pPr>
+      <w:r>
+        <w:rPr>
+          <w:rFonts w:ascii="Apple Color Emoji" w:eastAsia="Times New Roman" w:hAnsi="Apple Color Emoji" w:cs="Apple Color Emoji"/>
+          <w:kern w:val="0"/>
+          <w:lang w:val="en-SA"/>
+          <w14:ligatures w14:val="none"/>
+        </w:rPr>
+        <w:drawing>
+          <wp:inline distT="0" distB="0" distL="0" distR="0" wp14:anchorId="0AFF2FF4" wp14:editId="2803C5B0">
+            <wp:extent cx="5943600" cy="906145"/>
+            <wp:effectExtent l="0" t="0" r="0" b="0"/>
+            <wp:docPr id="648418276" name="Picture 1"/>
+            <wp:cNvGraphicFramePr>
+              <a:graphicFrameLocks xmlns:a="http://schemas.openxmlformats.org/drawingml/2006/main" noChangeAspect="1"/>
+            </wp:cNvGraphicFramePr>
+            <a:graphic xmlns:a="http://schemas.openxmlformats.org/drawingml/2006/main">
+              <a:graphicData uri="http://schemas.openxmlformats.org/drawingml/2006/picture">
+                <pic:pic xmlns:pic="http://schemas.openxmlformats.org/drawingml/2006/picture">
+                  <pic:nvPicPr>
+                    <pic:cNvPr id="648418276" name=""/>
+                    <pic:cNvPicPr/>
+                  </pic:nvPicPr>
+                  <pic:blipFill>
+                    <a:blip r:embed="rId13"/>
+                    <a:stretch>
+                      <a:fillRect/>
+                    </a:stretch>
+                  </pic:blipFill>
+                  <pic:spPr>
+                    <a:xfrm>
+                      <a:off x="0" y="0"/>
+                      <a:ext cx="5943600" cy="906145"/>
+                    </a:xfrm>
+                    <a:prstGeom prst="rect">
+                      <a:avLst/>
+                    </a:prstGeom>
+                  </pic:spPr>
+                </pic:pic>
+              </a:graphicData>
+            </a:graphic>
+          </wp:inline>
+        </w:drawing>
       </w:r>
     </w:p>
     <w:p>
@@ -2331,224 +2244,216 @@
           <w:lang w:val="en-SA"/>
           <w14:ligatures w14:val="none"/>
         </w:rPr>
+        <w:t>Verification After Fix</w:t>
+      </w:r>
+    </w:p>
+    <w:p>
+      <w:pPr>
+        <w:spacing w:before="100" w:beforeAutospacing="1" w:after="100" w:afterAutospacing="1" w:line="240" w:lineRule="auto"/>
+        <w:rPr>
+          <w:rFonts w:ascii="Times New Roman" w:eastAsia="Times New Roman" w:hAnsi="Times New Roman" w:cs="Times New Roman"/>
+          <w:kern w:val="0"/>
+          <w:lang w:val="en-SA"/>
+          <w14:ligatures w14:val="none"/>
+        </w:rPr>
+      </w:pPr>
+    </w:p>
+    <w:p>
+      <w:pPr>
+        <w:spacing w:before="100" w:beforeAutospacing="1" w:after="100" w:afterAutospacing="1" w:line="240" w:lineRule="auto"/>
+        <w:rPr>
+          <w:rFonts w:ascii="Times New Roman" w:eastAsia="Times New Roman" w:hAnsi="Times New Roman" w:cs="Times New Roman"/>
+          <w:kern w:val="0"/>
+          <w:lang w:val="en-SA"/>
+          <w14:ligatures w14:val="none"/>
+        </w:rPr>
+      </w:pPr>
+      <w:r>
+        <w:rPr>
+          <w:rFonts w:ascii="Times New Roman" w:eastAsia="Times New Roman" w:hAnsi="Times New Roman" w:cs="Times New Roman"/>
+          <w:kern w:val="0"/>
+          <w:lang w:val="en-SA"/>
+          <w14:ligatures w14:val="none"/>
+        </w:rPr>
+        <w:t>After applying the fix, the same exploit payload was sent again:</w:t>
+      </w:r>
+    </w:p>
+    <w:p>
+      <w:pPr>
+        <w:spacing w:before="100" w:beforeAutospacing="1" w:after="100" w:afterAutospacing="1" w:line="240" w:lineRule="auto"/>
+        <w:rPr>
+          <w:rFonts w:ascii="Times New Roman" w:eastAsia="Times New Roman" w:hAnsi="Times New Roman" w:cs="Times New Roman"/>
+          <w:kern w:val="0"/>
+          <w:lang w:val="en-SA"/>
+          <w14:ligatures w14:val="none"/>
+        </w:rPr>
+      </w:pPr>
+      <w:r>
+        <w:rPr>
+          <w:rFonts w:ascii="Times New Roman" w:eastAsia="Times New Roman" w:hAnsi="Times New Roman" w:cs="Times New Roman"/>
+          <w:kern w:val="0"/>
+          <w:lang w:val="en-SA"/>
+          <w14:ligatures w14:val="none"/>
+        </w:rPr>
+        <w:t>{</w:t>
+      </w:r>
+    </w:p>
+    <w:p>
+      <w:pPr>
+        <w:spacing w:before="100" w:beforeAutospacing="1" w:after="100" w:afterAutospacing="1" w:line="240" w:lineRule="auto"/>
+        <w:rPr>
+          <w:rFonts w:ascii="Times New Roman" w:eastAsia="Times New Roman" w:hAnsi="Times New Roman" w:cs="Times New Roman"/>
+          <w:kern w:val="0"/>
+          <w:lang w:val="en-SA"/>
+          <w14:ligatures w14:val="none"/>
+        </w:rPr>
+      </w:pPr>
+      <w:r>
+        <w:rPr>
+          <w:rFonts w:ascii="Times New Roman" w:eastAsia="Times New Roman" w:hAnsi="Times New Roman" w:cs="Times New Roman"/>
+          <w:kern w:val="0"/>
+          <w:lang w:val="en-SA"/>
+          <w14:ligatures w14:val="none"/>
+        </w:rPr>
+        <w:t>“action”: “orders”,</w:t>
+      </w:r>
+    </w:p>
+    <w:p>
+      <w:pPr>
+        <w:spacing w:before="100" w:beforeAutospacing="1" w:after="100" w:afterAutospacing="1" w:line="240" w:lineRule="auto"/>
+        <w:rPr>
+          <w:rFonts w:ascii="Times New Roman" w:eastAsia="Times New Roman" w:hAnsi="Times New Roman" w:cs="Times New Roman"/>
+          <w:kern w:val="0"/>
+          <w:lang w:val="en-SA"/>
+          <w14:ligatures w14:val="none"/>
+        </w:rPr>
+      </w:pPr>
+      <w:r>
+        <w:rPr>
+          <w:rFonts w:ascii="Times New Roman" w:eastAsia="Times New Roman" w:hAnsi="Times New Roman" w:cs="Times New Roman"/>
+          <w:kern w:val="0"/>
+          <w:lang w:val="en-SA"/>
+          <w14:ligatures w14:val="none"/>
+        </w:rPr>
+        <w:t>“test”: “_$$ND_FUNC$$_function(){throw ‘INJECTEDbyMK’}()”</w:t>
+      </w:r>
+    </w:p>
+    <w:p>
+      <w:pPr>
+        <w:spacing w:before="100" w:beforeAutospacing="1" w:after="100" w:afterAutospacing="1" w:line="240" w:lineRule="auto"/>
+        <w:rPr>
+          <w:rFonts w:ascii="Times New Roman" w:eastAsia="Times New Roman" w:hAnsi="Times New Roman" w:cs="Times New Roman"/>
+          <w:kern w:val="0"/>
+          <w:lang w:val="en-SA"/>
+          <w14:ligatures w14:val="none"/>
+        </w:rPr>
+      </w:pPr>
+      <w:r>
+        <w:rPr>
+          <w:rFonts w:ascii="Times New Roman" w:eastAsia="Times New Roman" w:hAnsi="Times New Roman" w:cs="Times New Roman"/>
+          <w:kern w:val="0"/>
+          <w:lang w:val="en-SA"/>
+          <w14:ligatures w14:val="none"/>
+        </w:rPr>
+        <w:t>}</w:t>
+      </w:r>
+    </w:p>
+    <w:p>
+      <w:pPr>
+        <w:spacing w:before="100" w:beforeAutospacing="1" w:after="100" w:afterAutospacing="1" w:line="240" w:lineRule="auto"/>
+        <w:rPr>
+          <w:rFonts w:ascii="Times New Roman" w:eastAsia="Times New Roman" w:hAnsi="Times New Roman" w:cs="Times New Roman"/>
+          <w:kern w:val="0"/>
+          <w:lang w:val="en-SA"/>
+          <w14:ligatures w14:val="none"/>
+        </w:rPr>
+      </w:pPr>
+      <w:r>
+        <w:rPr>
+          <w:rFonts w:ascii="Times New Roman" w:eastAsia="Times New Roman" w:hAnsi="Times New Roman" w:cs="Times New Roman"/>
+          <w:kern w:val="0"/>
+          <w:lang w:val="en-SA"/>
+          <w14:ligatures w14:val="none"/>
+        </w:rPr>
+        <w:t>This time, the backend processed the request without executing the payload. The request either returned a normal response or rejected the malformed input without triggering an internal error.</w:t>
+      </w:r>
+    </w:p>
+    <w:p>
+      <w:pPr>
+        <w:spacing w:before="100" w:beforeAutospacing="1" w:after="100" w:afterAutospacing="1" w:line="240" w:lineRule="auto"/>
+        <w:rPr>
+          <w:rFonts w:ascii="Times New Roman" w:eastAsia="Times New Roman" w:hAnsi="Times New Roman" w:cs="Times New Roman"/>
+          <w:kern w:val="0"/>
+          <w:lang w:val="en-SA"/>
+          <w14:ligatures w14:val="none"/>
+        </w:rPr>
+      </w:pPr>
+    </w:p>
+    <w:p>
+      <w:pPr>
+        <w:spacing w:before="100" w:beforeAutospacing="1" w:after="100" w:afterAutospacing="1" w:line="240" w:lineRule="auto"/>
+        <w:rPr>
+          <w:rFonts w:ascii="Times New Roman" w:eastAsia="Times New Roman" w:hAnsi="Times New Roman" w:cs="Times New Roman"/>
+          <w:kern w:val="0"/>
+          <w:lang w:val="en-SA"/>
+          <w14:ligatures w14:val="none"/>
+        </w:rPr>
+      </w:pPr>
+    </w:p>
+    <w:p>
+      <w:pPr>
+        <w:spacing w:after="0" w:line="240" w:lineRule="auto"/>
+        <w:rPr>
+          <w:rFonts w:ascii="Times New Roman" w:eastAsia="Times New Roman" w:hAnsi="Times New Roman" w:cs="Times New Roman"/>
+          <w:kern w:val="0"/>
+          <w:lang w:val="en-SA"/>
+          <w14:ligatures w14:val="none"/>
+        </w:rPr>
+      </w:pPr>
+      <w:r>
+        <w:rPr>
+          <w:rFonts w:ascii="Apple Color Emoji" w:eastAsia="Times New Roman" w:hAnsi="Apple Color Emoji" w:cs="Apple Color Emoji"/>
+          <w:kern w:val="0"/>
+          <w:lang w:val="en-SA"/>
+          <w14:ligatures w14:val="none"/>
+        </w:rPr>
         <w:lastRenderedPageBreak/>
-        <w:t>Verification After Fix</w:t>
-      </w:r>
-    </w:p>
-    <w:p>
-      <w:pPr>
-        <w:spacing w:before="100" w:beforeAutospacing="1" w:after="100" w:afterAutospacing="1" w:line="240" w:lineRule="auto"/>
-        <w:rPr>
-          <w:rFonts w:ascii="Times New Roman" w:eastAsia="Times New Roman" w:hAnsi="Times New Roman" w:cs="Times New Roman"/>
-          <w:kern w:val="0"/>
-          <w:lang w:val="en-SA"/>
-          <w14:ligatures w14:val="none"/>
-        </w:rPr>
-      </w:pPr>
-    </w:p>
-    <w:p>
-      <w:pPr>
-        <w:spacing w:before="100" w:beforeAutospacing="1" w:after="100" w:afterAutospacing="1" w:line="240" w:lineRule="auto"/>
-        <w:rPr>
-          <w:rFonts w:ascii="Times New Roman" w:eastAsia="Times New Roman" w:hAnsi="Times New Roman" w:cs="Times New Roman"/>
-          <w:kern w:val="0"/>
-          <w:lang w:val="en-SA"/>
-          <w14:ligatures w14:val="none"/>
-        </w:rPr>
-      </w:pPr>
-      <w:r>
-        <w:rPr>
-          <w:rFonts w:ascii="Times New Roman" w:eastAsia="Times New Roman" w:hAnsi="Times New Roman" w:cs="Times New Roman"/>
-          <w:kern w:val="0"/>
-          <w:lang w:val="en-SA"/>
-          <w14:ligatures w14:val="none"/>
-        </w:rPr>
-        <w:t>After applying the fix, the same exploit payload was sent again:</w:t>
-      </w:r>
-    </w:p>
-    <w:p>
-      <w:pPr>
-        <w:spacing w:before="100" w:beforeAutospacing="1" w:after="100" w:afterAutospacing="1" w:line="240" w:lineRule="auto"/>
-        <w:rPr>
-          <w:rFonts w:ascii="Times New Roman" w:eastAsia="Times New Roman" w:hAnsi="Times New Roman" w:cs="Times New Roman"/>
-          <w:kern w:val="0"/>
-          <w:lang w:val="en-SA"/>
-          <w14:ligatures w14:val="none"/>
-        </w:rPr>
-      </w:pPr>
-    </w:p>
-    <w:p>
-      <w:pPr>
-        <w:spacing w:before="100" w:beforeAutospacing="1" w:after="100" w:afterAutospacing="1" w:line="240" w:lineRule="auto"/>
-        <w:rPr>
-          <w:rFonts w:ascii="Times New Roman" w:eastAsia="Times New Roman" w:hAnsi="Times New Roman" w:cs="Times New Roman"/>
-          <w:kern w:val="0"/>
-          <w:lang w:val="en-SA"/>
-          <w14:ligatures w14:val="none"/>
-        </w:rPr>
-      </w:pPr>
-      <w:r>
-        <w:rPr>
-          <w:rFonts w:ascii="Times New Roman" w:eastAsia="Times New Roman" w:hAnsi="Times New Roman" w:cs="Times New Roman"/>
-          <w:kern w:val="0"/>
-          <w:lang w:val="en-SA"/>
-          <w14:ligatures w14:val="none"/>
-        </w:rPr>
-        <w:t>{</w:t>
-      </w:r>
-    </w:p>
-    <w:p>
-      <w:pPr>
-        <w:spacing w:before="100" w:beforeAutospacing="1" w:after="100" w:afterAutospacing="1" w:line="240" w:lineRule="auto"/>
-        <w:rPr>
-          <w:rFonts w:ascii="Times New Roman" w:eastAsia="Times New Roman" w:hAnsi="Times New Roman" w:cs="Times New Roman"/>
-          <w:kern w:val="0"/>
-          <w:lang w:val="en-SA"/>
-          <w14:ligatures w14:val="none"/>
-        </w:rPr>
-      </w:pPr>
-      <w:r>
-        <w:rPr>
-          <w:rFonts w:ascii="Times New Roman" w:eastAsia="Times New Roman" w:hAnsi="Times New Roman" w:cs="Times New Roman"/>
-          <w:kern w:val="0"/>
-          <w:lang w:val="en-SA"/>
-          <w14:ligatures w14:val="none"/>
-        </w:rPr>
-        <w:t>“action”: “orders”,</w:t>
-      </w:r>
-    </w:p>
-    <w:p>
-      <w:pPr>
-        <w:spacing w:before="100" w:beforeAutospacing="1" w:after="100" w:afterAutospacing="1" w:line="240" w:lineRule="auto"/>
-        <w:rPr>
-          <w:rFonts w:ascii="Times New Roman" w:eastAsia="Times New Roman" w:hAnsi="Times New Roman" w:cs="Times New Roman"/>
-          <w:kern w:val="0"/>
-          <w:lang w:val="en-SA"/>
-          <w14:ligatures w14:val="none"/>
-        </w:rPr>
-      </w:pPr>
-      <w:r>
-        <w:rPr>
-          <w:rFonts w:ascii="Times New Roman" w:eastAsia="Times New Roman" w:hAnsi="Times New Roman" w:cs="Times New Roman"/>
-          <w:kern w:val="0"/>
-          <w:lang w:val="en-SA"/>
-          <w14:ligatures w14:val="none"/>
-        </w:rPr>
-        <w:t>“test”: “_$$ND_FUNC$$_function(){throw ‘INJECTEDbyMK’}()”</w:t>
-      </w:r>
-    </w:p>
-    <w:p>
-      <w:pPr>
-        <w:spacing w:before="100" w:beforeAutospacing="1" w:after="100" w:afterAutospacing="1" w:line="240" w:lineRule="auto"/>
-        <w:rPr>
-          <w:rFonts w:ascii="Times New Roman" w:eastAsia="Times New Roman" w:hAnsi="Times New Roman" w:cs="Times New Roman"/>
-          <w:kern w:val="0"/>
-          <w:lang w:val="en-SA"/>
-          <w14:ligatures w14:val="none"/>
-        </w:rPr>
-      </w:pPr>
-      <w:r>
-        <w:rPr>
-          <w:rFonts w:ascii="Times New Roman" w:eastAsia="Times New Roman" w:hAnsi="Times New Roman" w:cs="Times New Roman"/>
-          <w:kern w:val="0"/>
-          <w:lang w:val="en-SA"/>
-          <w14:ligatures w14:val="none"/>
-        </w:rPr>
-        <w:t>}</w:t>
-      </w:r>
-    </w:p>
-    <w:p>
-      <w:pPr>
-        <w:spacing w:before="100" w:beforeAutospacing="1" w:after="100" w:afterAutospacing="1" w:line="240" w:lineRule="auto"/>
-        <w:rPr>
-          <w:rFonts w:ascii="Times New Roman" w:eastAsia="Times New Roman" w:hAnsi="Times New Roman" w:cs="Times New Roman"/>
-          <w:kern w:val="0"/>
-          <w:lang w:val="en-SA"/>
-          <w14:ligatures w14:val="none"/>
-        </w:rPr>
-      </w:pPr>
-    </w:p>
-    <w:p>
-      <w:pPr>
-        <w:spacing w:before="100" w:beforeAutospacing="1" w:after="100" w:afterAutospacing="1" w:line="240" w:lineRule="auto"/>
-        <w:rPr>
-          <w:rFonts w:ascii="Times New Roman" w:eastAsia="Times New Roman" w:hAnsi="Times New Roman" w:cs="Times New Roman"/>
-          <w:kern w:val="0"/>
-          <w:lang w:val="en-SA"/>
-          <w14:ligatures w14:val="none"/>
-        </w:rPr>
-      </w:pPr>
-      <w:r>
-        <w:rPr>
-          <w:rFonts w:ascii="Times New Roman" w:eastAsia="Times New Roman" w:hAnsi="Times New Roman" w:cs="Times New Roman"/>
-          <w:kern w:val="0"/>
-          <w:lang w:val="en-SA"/>
-          <w14:ligatures w14:val="none"/>
-        </w:rPr>
-        <w:t>This time, the backend processed the request without executing the payload. The request either returned a normal response or rejected the malformed input without triggering an internal error.</w:t>
-      </w:r>
-    </w:p>
-    <w:p>
-      <w:pPr>
-        <w:spacing w:before="100" w:beforeAutospacing="1" w:after="100" w:afterAutospacing="1" w:line="240" w:lineRule="auto"/>
-        <w:rPr>
-          <w:rFonts w:ascii="Times New Roman" w:eastAsia="Times New Roman" w:hAnsi="Times New Roman" w:cs="Times New Roman"/>
-          <w:kern w:val="0"/>
-          <w:lang w:val="en-SA"/>
-          <w14:ligatures w14:val="none"/>
-        </w:rPr>
-      </w:pPr>
-    </w:p>
-    <w:p>
-      <w:pPr>
-        <w:spacing w:before="100" w:beforeAutospacing="1" w:after="100" w:afterAutospacing="1" w:line="240" w:lineRule="auto"/>
-        <w:rPr>
-          <w:rFonts w:ascii="Times New Roman" w:eastAsia="Times New Roman" w:hAnsi="Times New Roman" w:cs="Times New Roman"/>
-          <w:kern w:val="0"/>
-          <w:lang w:val="en-SA"/>
-          <w14:ligatures w14:val="none"/>
-        </w:rPr>
-      </w:pPr>
-      <w:r>
-        <w:rPr>
-          <w:rFonts w:ascii="Apple Color Emoji" w:eastAsia="Times New Roman" w:hAnsi="Apple Color Emoji" w:cs="Apple Color Emoji"/>
-          <w:kern w:val="0"/>
-          <w:lang w:val="en-SA"/>
-          <w14:ligatures w14:val="none"/>
-        </w:rPr>
-        <w:t>📸</w:t>
-      </w:r>
-      <w:r>
-        <w:rPr>
-          <w:rFonts w:ascii="Times New Roman" w:eastAsia="Times New Roman" w:hAnsi="Times New Roman" w:cs="Times New Roman"/>
-          <w:kern w:val="0"/>
-          <w:lang w:val="en-SA"/>
-          <w14:ligatures w14:val="none"/>
-        </w:rPr>
-        <w:t xml:space="preserve"> </w:t>
-      </w:r>
-      <w:r>
-        <w:rPr>
-          <w:rFonts w:ascii="Times New Roman" w:eastAsia="Times New Roman" w:hAnsi="Times New Roman" w:cs="Times New Roman"/>
-          <w:b/>
-          <w:bCs/>
-          <w:kern w:val="0"/>
-          <w:lang w:val="en-SA"/>
-          <w14:ligatures w14:val="none"/>
-        </w:rPr>
-        <w:t>[Screenshot Placeholder 7: Postman showing exploit payload no longer causing error]</w:t>
-      </w:r>
-    </w:p>
-    <w:p>
-      <w:pPr>
-        <w:spacing w:after="0" w:line="240" w:lineRule="auto"/>
-        <w:rPr>
-          <w:rFonts w:ascii="Times New Roman" w:eastAsia="Times New Roman" w:hAnsi="Times New Roman" w:cs="Times New Roman"/>
-          <w:kern w:val="0"/>
-          <w:lang w:val="en-SA"/>
-          <w14:ligatures w14:val="none"/>
-        </w:rPr>
-      </w:pPr>
+        <w:drawing>
+          <wp:inline distT="0" distB="0" distL="0" distR="0" wp14:anchorId="1373227F" wp14:editId="4FAF48BD">
+            <wp:extent cx="5943600" cy="3376930"/>
+            <wp:effectExtent l="0" t="0" r="0" b="1270"/>
+            <wp:docPr id="1588162647" name="Picture 1"/>
+            <wp:cNvGraphicFramePr>
+              <a:graphicFrameLocks xmlns:a="http://schemas.openxmlformats.org/drawingml/2006/main" noChangeAspect="1"/>
+            </wp:cNvGraphicFramePr>
+            <a:graphic xmlns:a="http://schemas.openxmlformats.org/drawingml/2006/main">
+              <a:graphicData uri="http://schemas.openxmlformats.org/drawingml/2006/picture">
+                <pic:pic xmlns:pic="http://schemas.openxmlformats.org/drawingml/2006/picture">
+                  <pic:nvPicPr>
+                    <pic:cNvPr id="1588162647" name=""/>
+                    <pic:cNvPicPr/>
+                  </pic:nvPicPr>
+                  <pic:blipFill>
+                    <a:blip r:embed="rId14"/>
+                    <a:stretch>
+                      <a:fillRect/>
+                    </a:stretch>
+                  </pic:blipFill>
+                  <pic:spPr>
+                    <a:xfrm>
+                      <a:off x="0" y="0"/>
+                      <a:ext cx="5943600" cy="3376930"/>
+                    </a:xfrm>
+                    <a:prstGeom prst="rect">
+                      <a:avLst/>
+                    </a:prstGeom>
+                  </pic:spPr>
+                </pic:pic>
+              </a:graphicData>
+            </a:graphic>
+          </wp:inline>
+        </w:drawing>
+      </w:r>
       <w:r>
         <w:rPr>
           <w:rFonts w:ascii="Times New Roman" w:eastAsia="Times New Roman" w:hAnsi="Times New Roman" w:cs="Times New Roman"/>
@@ -2594,7 +2499,7 @@
     </w:p>
     <w:p>
       <w:pPr>
-        <w:spacing w:before="100" w:beforeAutospacing="1" w:after="100" w:afterAutospacing="1" w:line="240" w:lineRule="auto"/>
+        <w:spacing w:after="0" w:line="240" w:lineRule="auto"/>
         <w:rPr>
           <w:rFonts w:ascii="Times New Roman" w:eastAsia="Times New Roman" w:hAnsi="Times New Roman" w:cs="Times New Roman"/>
           <w:kern w:val="0"/>
@@ -2609,39 +2514,42 @@
           <w:lang w:val="en-SA"/>
           <w14:ligatures w14:val="none"/>
         </w:rPr>
-        <w:t>📸</w:t>
-      </w:r>
-      <w:r>
-        <w:rPr>
-          <w:rFonts w:ascii="Times New Roman" w:eastAsia="Times New Roman" w:hAnsi="Times New Roman" w:cs="Times New Roman"/>
-          <w:kern w:val="0"/>
-          <w:lang w:val="en-SA"/>
-          <w14:ligatures w14:val="none"/>
-        </w:rPr>
-        <w:t xml:space="preserve"> </w:t>
-      </w:r>
-      <w:r>
-        <w:rPr>
-          <w:rFonts w:ascii="Times New Roman" w:eastAsia="Times New Roman" w:hAnsi="Times New Roman" w:cs="Times New Roman"/>
-          <w:b/>
-          <w:bCs/>
-          <w:kern w:val="0"/>
-          <w:lang w:val="en-SA"/>
-          <w14:ligatures w14:val="none"/>
-        </w:rPr>
-        <w:t>[Screenshot Placeholder 8: CloudWatch logs showing no injected execution after fix]</w:t>
-      </w:r>
-    </w:p>
-    <w:p>
-      <w:pPr>
-        <w:spacing w:after="0" w:line="240" w:lineRule="auto"/>
-        <w:rPr>
-          <w:rFonts w:ascii="Times New Roman" w:eastAsia="Times New Roman" w:hAnsi="Times New Roman" w:cs="Times New Roman"/>
-          <w:kern w:val="0"/>
-          <w:lang w:val="en-SA"/>
-          <w14:ligatures w14:val="none"/>
-        </w:rPr>
-      </w:pPr>
+        <w:drawing>
+          <wp:inline distT="0" distB="0" distL="0" distR="0" wp14:anchorId="14F65B54" wp14:editId="3D2944FA">
+            <wp:extent cx="5943600" cy="553085"/>
+            <wp:effectExtent l="0" t="0" r="0" b="5715"/>
+            <wp:docPr id="643731984" name="Picture 1"/>
+            <wp:cNvGraphicFramePr>
+              <a:graphicFrameLocks xmlns:a="http://schemas.openxmlformats.org/drawingml/2006/main" noChangeAspect="1"/>
+            </wp:cNvGraphicFramePr>
+            <a:graphic xmlns:a="http://schemas.openxmlformats.org/drawingml/2006/main">
+              <a:graphicData uri="http://schemas.openxmlformats.org/drawingml/2006/picture">
+                <pic:pic xmlns:pic="http://schemas.openxmlformats.org/drawingml/2006/picture">
+                  <pic:nvPicPr>
+                    <pic:cNvPr id="643731984" name=""/>
+                    <pic:cNvPicPr/>
+                  </pic:nvPicPr>
+                  <pic:blipFill>
+                    <a:blip r:embed="rId15"/>
+                    <a:stretch>
+                      <a:fillRect/>
+                    </a:stretch>
+                  </pic:blipFill>
+                  <pic:spPr>
+                    <a:xfrm>
+                      <a:off x="0" y="0"/>
+                      <a:ext cx="5943600" cy="553085"/>
+                    </a:xfrm>
+                    <a:prstGeom prst="rect">
+                      <a:avLst/>
+                    </a:prstGeom>
+                  </pic:spPr>
+                </pic:pic>
+              </a:graphicData>
+            </a:graphic>
+          </wp:inline>
+        </w:drawing>
+      </w:r>
       <w:r>
         <w:rPr>
           <w:rFonts w:ascii="Times New Roman" w:eastAsia="Times New Roman" w:hAnsi="Times New Roman" w:cs="Times New Roman"/>
@@ -2666,6 +2574,70 @@
       </w:pPr>
       <w:r>
         <w:rPr>
+          <w:rFonts w:ascii="Apple Color Emoji" w:eastAsia="Times New Roman" w:hAnsi="Apple Color Emoji" w:cs="Apple Color Emoji"/>
+          <w:kern w:val="0"/>
+          <w:lang w:val="en-SA"/>
+          <w14:ligatures w14:val="none"/>
+        </w:rPr>
+        <w:lastRenderedPageBreak/>
+        <w:drawing>
+          <wp:anchor distT="0" distB="0" distL="114300" distR="114300" simplePos="0" relativeHeight="251658240" behindDoc="0" locked="0" layoutInCell="1" allowOverlap="1" wp14:anchorId="4158AC82" wp14:editId="2AC32D3B">
+            <wp:simplePos x="0" y="0"/>
+            <wp:positionH relativeFrom="column">
+              <wp:posOffset>512064</wp:posOffset>
+            </wp:positionH>
+            <wp:positionV relativeFrom="paragraph">
+              <wp:posOffset>353695</wp:posOffset>
+            </wp:positionV>
+            <wp:extent cx="4836160" cy="2669540"/>
+            <wp:effectExtent l="0" t="0" r="2540" b="0"/>
+            <wp:wrapTopAndBottom/>
+            <wp:docPr id="1551684832" name="Picture 1" descr="A screenshot of a computer&#10;&#10;AI-generated content may be incorrect."/>
+            <wp:cNvGraphicFramePr>
+              <a:graphicFrameLocks xmlns:a="http://schemas.openxmlformats.org/drawingml/2006/main" noChangeAspect="1"/>
+            </wp:cNvGraphicFramePr>
+            <a:graphic xmlns:a="http://schemas.openxmlformats.org/drawingml/2006/main">
+              <a:graphicData uri="http://schemas.openxmlformats.org/drawingml/2006/picture">
+                <pic:pic xmlns:pic="http://schemas.openxmlformats.org/drawingml/2006/picture">
+                  <pic:nvPicPr>
+                    <pic:cNvPr id="1551684832" name="Picture 1" descr="A screenshot of a computer&#10;&#10;AI-generated content may be incorrect."/>
+                    <pic:cNvPicPr/>
+                  </pic:nvPicPr>
+                  <pic:blipFill>
+                    <a:blip r:embed="rId16" cstate="print">
+                      <a:extLst>
+                        <a:ext uri="{28A0092B-C50C-407E-A947-70E740481C1C}">
+                          <a14:useLocalDpi xmlns:a14="http://schemas.microsoft.com/office/drawing/2010/main" val="0"/>
+                        </a:ext>
+                      </a:extLst>
+                    </a:blip>
+                    <a:stretch>
+                      <a:fillRect/>
+                    </a:stretch>
+                  </pic:blipFill>
+                  <pic:spPr>
+                    <a:xfrm>
+                      <a:off x="0" y="0"/>
+                      <a:ext cx="4836160" cy="2669540"/>
+                    </a:xfrm>
+                    <a:prstGeom prst="rect">
+                      <a:avLst/>
+                    </a:prstGeom>
+                  </pic:spPr>
+                </pic:pic>
+              </a:graphicData>
+            </a:graphic>
+            <wp14:sizeRelH relativeFrom="page">
+              <wp14:pctWidth>0</wp14:pctWidth>
+            </wp14:sizeRelH>
+            <wp14:sizeRelV relativeFrom="page">
+              <wp14:pctHeight>0</wp14:pctHeight>
+            </wp14:sizeRelV>
+          </wp:anchor>
+        </w:drawing>
+      </w:r>
+      <w:r>
+        <w:rPr>
           <w:rFonts w:ascii="Times New Roman" w:eastAsia="Times New Roman" w:hAnsi="Times New Roman" w:cs="Times New Roman"/>
           <w:kern w:val="0"/>
           <w:lang w:val="en-SA"/>
@@ -2684,46 +2656,6 @@
           <w14:ligatures w14:val="none"/>
         </w:rPr>
       </w:pPr>
-    </w:p>
-    <w:p>
-      <w:pPr>
-        <w:spacing w:before="100" w:beforeAutospacing="1" w:after="100" w:afterAutospacing="1" w:line="240" w:lineRule="auto"/>
-        <w:rPr>
-          <w:rFonts w:ascii="Times New Roman" w:eastAsia="Times New Roman" w:hAnsi="Times New Roman" w:cs="Times New Roman"/>
-          <w:kern w:val="0"/>
-          <w:lang w:val="en-SA"/>
-          <w14:ligatures w14:val="none"/>
-        </w:rPr>
-      </w:pPr>
-      <w:r>
-        <w:rPr>
-          <w:rFonts w:ascii="Apple Color Emoji" w:eastAsia="Times New Roman" w:hAnsi="Apple Color Emoji" w:cs="Apple Color Emoji"/>
-          <w:kern w:val="0"/>
-          <w:lang w:val="en-SA"/>
-          <w14:ligatures w14:val="none"/>
-        </w:rPr>
-        <w:t>📸</w:t>
-      </w:r>
-      <w:r>
-        <w:rPr>
-          <w:rFonts w:ascii="Times New Roman" w:eastAsia="Times New Roman" w:hAnsi="Times New Roman" w:cs="Times New Roman"/>
-          <w:kern w:val="0"/>
-          <w:lang w:val="en-SA"/>
-          <w14:ligatures w14:val="none"/>
-        </w:rPr>
-        <w:t xml:space="preserve"> </w:t>
-      </w:r>
-      <w:r>
-        <w:rPr>
-          <w:rFonts w:ascii="Times New Roman" w:eastAsia="Times New Roman" w:hAnsi="Times New Roman" w:cs="Times New Roman"/>
-          <w:b/>
-          <w:bCs/>
-          <w:kern w:val="0"/>
-          <w:lang w:val="en-SA"/>
-          <w14:ligatures w14:val="none"/>
-        </w:rPr>
-        <w:t>[Screenshot Placeholder 9: Postman showing normal request still working after fix]</w:t>
-      </w:r>
     </w:p>
     <w:p>
       <w:pPr>
@@ -2797,7 +2729,6 @@
           <w:lang w:val="en-SA"/>
           <w14:ligatures w14:val="none"/>
         </w:rPr>
-        <w:lastRenderedPageBreak/>
         <w:t>Structured Operation and Security Analysis</w:t>
       </w:r>
     </w:p>
@@ -2840,17 +2771,6 @@
         </w:rPr>
         <w:t>1) Intended Logic and Security Rule(s)</w:t>
       </w:r>
-    </w:p>
-    <w:p>
-      <w:pPr>
-        <w:spacing w:before="100" w:beforeAutospacing="1" w:after="100" w:afterAutospacing="1" w:line="240" w:lineRule="auto"/>
-        <w:rPr>
-          <w:rFonts w:ascii="Times New Roman" w:eastAsia="Times New Roman" w:hAnsi="Times New Roman" w:cs="Times New Roman"/>
-          <w:kern w:val="0"/>
-          <w:lang w:val="en-SA"/>
-          <w14:ligatures w14:val="none"/>
-        </w:rPr>
-      </w:pPr>
     </w:p>
     <w:p>
       <w:pPr>
@@ -3012,7 +2932,11 @@
           <w14:ligatures w14:val="none"/>
         </w:rPr>
       </w:pPr>
-      <w:r>
+    </w:p>
+    <w:p>
+      <w:pPr>
+        <w:spacing w:before="100" w:beforeAutospacing="1" w:after="100" w:afterAutospacing="1" w:line="240" w:lineRule="auto"/>
+        <w:outlineLvl w:val="2"/>
         <w:rPr>
           <w:rFonts w:ascii="Times New Roman" w:eastAsia="Times New Roman" w:hAnsi="Times New Roman" w:cs="Times New Roman"/>
           <w:b/>
@@ -3023,19 +2947,21 @@
           <w:lang w:val="en-SA"/>
           <w14:ligatures w14:val="none"/>
         </w:rPr>
+      </w:pPr>
+      <w:r>
+        <w:rPr>
+          <w:rFonts w:ascii="Times New Roman" w:eastAsia="Times New Roman" w:hAnsi="Times New Roman" w:cs="Times New Roman"/>
+          <w:b/>
+          <w:bCs/>
+          <w:kern w:val="0"/>
+          <w:sz w:val="27"/>
+          <w:szCs w:val="27"/>
+          <w:lang w:val="en-SA"/>
+          <w14:ligatures w14:val="none"/>
+        </w:rPr>
+        <w:lastRenderedPageBreak/>
         <w:t>2) Evidence Sources and Behavior Trace</w:t>
       </w:r>
-    </w:p>
-    <w:p>
-      <w:pPr>
-        <w:spacing w:before="100" w:beforeAutospacing="1" w:after="100" w:afterAutospacing="1" w:line="240" w:lineRule="auto"/>
-        <w:rPr>
-          <w:rFonts w:ascii="Times New Roman" w:eastAsia="Times New Roman" w:hAnsi="Times New Roman" w:cs="Times New Roman"/>
-          <w:kern w:val="0"/>
-          <w:lang w:val="en-SA"/>
-          <w14:ligatures w14:val="none"/>
-        </w:rPr>
-      </w:pPr>
     </w:p>
     <w:p>
       <w:pPr>
@@ -3417,100 +3343,27 @@
           <w:lang w:val="en-SA"/>
           <w14:ligatures w14:val="none"/>
         </w:rPr>
-        <w:t>The exploit behavior represents a clear deviation from intended system behavior. Instead of treating request input as plain data, the system executes attacker-controlled code during deserialization.</w:t>
-      </w:r>
-    </w:p>
-    <w:p>
-      <w:pPr>
-        <w:spacing w:before="100" w:beforeAutospacing="1" w:after="100" w:afterAutospacing="1" w:line="240" w:lineRule="auto"/>
-        <w:rPr>
-          <w:rFonts w:ascii="Times New Roman" w:eastAsia="Times New Roman" w:hAnsi="Times New Roman" w:cs="Times New Roman"/>
-          <w:kern w:val="0"/>
-          <w:lang w:val="en-SA"/>
-          <w14:ligatures w14:val="none"/>
-        </w:rPr>
-      </w:pPr>
-    </w:p>
-    <w:p>
-      <w:pPr>
-        <w:spacing w:before="100" w:beforeAutospacing="1" w:after="100" w:afterAutospacing="1" w:line="240" w:lineRule="auto"/>
-        <w:rPr>
-          <w:rFonts w:ascii="Times New Roman" w:eastAsia="Times New Roman" w:hAnsi="Times New Roman" w:cs="Times New Roman"/>
-          <w:kern w:val="0"/>
-          <w:lang w:val="en-SA"/>
-          <w14:ligatures w14:val="none"/>
-        </w:rPr>
-      </w:pPr>
-      <w:r>
-        <w:rPr>
-          <w:rFonts w:ascii="Times New Roman" w:eastAsia="Times New Roman" w:hAnsi="Times New Roman" w:cs="Times New Roman"/>
-          <w:kern w:val="0"/>
-          <w:lang w:val="en-SA"/>
-          <w14:ligatures w14:val="none"/>
-        </w:rPr>
-        <w:t>This violates the rule that user input must never influence code execution.</w:t>
-      </w:r>
-    </w:p>
-    <w:p>
-      <w:pPr>
-        <w:spacing w:before="100" w:beforeAutospacing="1" w:after="100" w:afterAutospacing="1" w:line="240" w:lineRule="auto"/>
-        <w:rPr>
-          <w:rFonts w:ascii="Times New Roman" w:eastAsia="Times New Roman" w:hAnsi="Times New Roman" w:cs="Times New Roman"/>
-          <w:kern w:val="0"/>
-          <w:lang w:val="en-SA"/>
-          <w14:ligatures w14:val="none"/>
-        </w:rPr>
-      </w:pPr>
-    </w:p>
-    <w:p>
-      <w:pPr>
-        <w:spacing w:before="100" w:beforeAutospacing="1" w:after="100" w:afterAutospacing="1" w:line="240" w:lineRule="auto"/>
-        <w:rPr>
-          <w:rFonts w:ascii="Times New Roman" w:eastAsia="Times New Roman" w:hAnsi="Times New Roman" w:cs="Times New Roman"/>
-          <w:kern w:val="0"/>
-          <w:lang w:val="en-SA"/>
-          <w14:ligatures w14:val="none"/>
-        </w:rPr>
-      </w:pPr>
-      <w:r>
-        <w:rPr>
-          <w:rFonts w:ascii="Times New Roman" w:eastAsia="Times New Roman" w:hAnsi="Times New Roman" w:cs="Times New Roman"/>
-          <w:kern w:val="0"/>
-          <w:lang w:val="en-SA"/>
-          <w14:ligatures w14:val="none"/>
-        </w:rPr>
-        <w:t>This case is classified as:</w:t>
-      </w:r>
-    </w:p>
-    <w:p>
-      <w:pPr>
-        <w:spacing w:before="100" w:beforeAutospacing="1" w:after="100" w:afterAutospacing="1" w:line="240" w:lineRule="auto"/>
-        <w:rPr>
-          <w:rFonts w:ascii="Times New Roman" w:eastAsia="Times New Roman" w:hAnsi="Times New Roman" w:cs="Times New Roman"/>
-          <w:kern w:val="0"/>
-          <w:lang w:val="en-SA"/>
-          <w14:ligatures w14:val="none"/>
-        </w:rPr>
-      </w:pPr>
-    </w:p>
-    <w:p>
-      <w:pPr>
-        <w:spacing w:before="100" w:beforeAutospacing="1" w:after="100" w:afterAutospacing="1" w:line="240" w:lineRule="auto"/>
-        <w:rPr>
-          <w:rFonts w:ascii="Times New Roman" w:eastAsia="Times New Roman" w:hAnsi="Times New Roman" w:cs="Times New Roman"/>
-          <w:kern w:val="0"/>
-          <w:lang w:val="en-SA"/>
-          <w14:ligatures w14:val="none"/>
-        </w:rPr>
-      </w:pPr>
-      <w:r>
-        <w:rPr>
-          <w:rFonts w:ascii="Times New Roman" w:eastAsia="Times New Roman" w:hAnsi="Times New Roman" w:cs="Times New Roman"/>
-          <w:kern w:val="0"/>
-          <w:lang w:val="en-SA"/>
-          <w14:ligatures w14:val="none"/>
-        </w:rPr>
-        <w:t>Intentional misuse / security-relevant abuse</w:t>
+        <w:t>The exploit behavior represents a clear deviation from intended system behavior. Instead of treating request input as plain data, the system executes attacker-controlled code during deserialization.This violates the rule that user input must never influence code execution.</w:t>
+      </w:r>
+    </w:p>
+    <w:p>
+      <w:pPr>
+        <w:spacing w:before="100" w:beforeAutospacing="1" w:after="100" w:afterAutospacing="1" w:line="240" w:lineRule="auto"/>
+        <w:rPr>
+          <w:rFonts w:ascii="Times New Roman" w:eastAsia="Times New Roman" w:hAnsi="Times New Roman" w:cs="Times New Roman"/>
+          <w:kern w:val="0"/>
+          <w:lang w:val="en-SA"/>
+          <w14:ligatures w14:val="none"/>
+        </w:rPr>
+      </w:pPr>
+      <w:r>
+        <w:rPr>
+          <w:rFonts w:ascii="Times New Roman" w:eastAsia="Times New Roman" w:hAnsi="Times New Roman" w:cs="Times New Roman"/>
+          <w:kern w:val="0"/>
+          <w:lang w:val="en-SA"/>
+          <w14:ligatures w14:val="none"/>
+        </w:rPr>
+        <w:t>This case is classified as:Intentional misuse / security-relevant abuse</w:t>
       </w:r>
     </w:p>
     <w:p>
@@ -3567,55 +3420,48 @@
     <w:p>
       <w:pPr>
         <w:spacing w:before="100" w:beforeAutospacing="1" w:after="100" w:afterAutospacing="1" w:line="240" w:lineRule="auto"/>
-        <w:rPr>
-          <w:rFonts w:ascii="Times New Roman" w:eastAsia="Times New Roman" w:hAnsi="Times New Roman" w:cs="Times New Roman"/>
-          <w:kern w:val="0"/>
-          <w:lang w:val="en-SA"/>
-          <w14:ligatures w14:val="none"/>
-        </w:rPr>
-      </w:pPr>
-    </w:p>
-    <w:p>
-      <w:pPr>
-        <w:spacing w:before="100" w:beforeAutospacing="1" w:after="100" w:afterAutospacing="1" w:line="240" w:lineRule="auto"/>
-        <w:rPr>
-          <w:rFonts w:ascii="Times New Roman" w:eastAsia="Times New Roman" w:hAnsi="Times New Roman" w:cs="Times New Roman"/>
-          <w:kern w:val="0"/>
-          <w:lang w:val="en-SA"/>
-          <w14:ligatures w14:val="none"/>
-        </w:rPr>
-      </w:pPr>
-      <w:r>
-        <w:rPr>
-          <w:rFonts w:ascii="Times New Roman" w:eastAsia="Times New Roman" w:hAnsi="Times New Roman" w:cs="Times New Roman"/>
-          <w:kern w:val="0"/>
-          <w:lang w:val="en-SA"/>
-          <w14:ligatures w14:val="none"/>
-        </w:rPr>
+        <w:outlineLvl w:val="2"/>
+        <w:rPr>
+          <w:rFonts w:ascii="Times New Roman" w:eastAsia="Times New Roman" w:hAnsi="Times New Roman" w:cs="Times New Roman"/>
+          <w:b/>
+          <w:bCs/>
+          <w:kern w:val="0"/>
+          <w:sz w:val="27"/>
+          <w:szCs w:val="27"/>
+          <w:lang w:val="en-SA"/>
+          <w14:ligatures w14:val="none"/>
+        </w:rPr>
+      </w:pPr>
+    </w:p>
+    <w:p>
+      <w:pPr>
+        <w:spacing w:before="100" w:beforeAutospacing="1" w:after="100" w:afterAutospacing="1" w:line="240" w:lineRule="auto"/>
+        <w:rPr>
+          <w:rFonts w:ascii="Times New Roman" w:eastAsia="Times New Roman" w:hAnsi="Times New Roman" w:cs="Times New Roman"/>
+          <w:kern w:val="0"/>
+          <w:lang w:val="en-SA"/>
+          <w14:ligatures w14:val="none"/>
+        </w:rPr>
+      </w:pPr>
+      <w:r>
+        <w:rPr>
+          <w:rFonts w:ascii="Times New Roman" w:eastAsia="Times New Roman" w:hAnsi="Times New Roman" w:cs="Times New Roman"/>
+          <w:kern w:val="0"/>
+          <w:lang w:val="en-SA"/>
+          <w14:ligatures w14:val="none"/>
+        </w:rPr>
+        <w:lastRenderedPageBreak/>
         <w:t>The incorrect assumption in the system was that deserializing request input using node-serialize is safe. This assumption is invalid because the library supports execution of serialized functions.</w:t>
       </w:r>
-    </w:p>
-    <w:p>
-      <w:pPr>
-        <w:spacing w:before="100" w:beforeAutospacing="1" w:after="100" w:afterAutospacing="1" w:line="240" w:lineRule="auto"/>
-        <w:rPr>
-          <w:rFonts w:ascii="Times New Roman" w:eastAsia="Times New Roman" w:hAnsi="Times New Roman" w:cs="Times New Roman"/>
-          <w:kern w:val="0"/>
-          <w:lang w:val="en-SA"/>
-          <w14:ligatures w14:val="none"/>
-        </w:rPr>
-      </w:pPr>
-    </w:p>
-    <w:p>
-      <w:pPr>
-        <w:spacing w:before="100" w:beforeAutospacing="1" w:after="100" w:afterAutospacing="1" w:line="240" w:lineRule="auto"/>
-        <w:rPr>
-          <w:rFonts w:ascii="Times New Roman" w:eastAsia="Times New Roman" w:hAnsi="Times New Roman" w:cs="Times New Roman"/>
-          <w:kern w:val="0"/>
-          <w:lang w:val="en-SA"/>
-          <w14:ligatures w14:val="none"/>
-        </w:rPr>
-      </w:pPr>
+      <w:r>
+        <w:rPr>
+          <w:rFonts w:ascii="Times New Roman" w:eastAsia="Times New Roman" w:hAnsi="Times New Roman" w:cs="Times New Roman"/>
+          <w:kern w:val="0"/>
+          <w:lang w:val="en-SA"/>
+          <w14:ligatures w14:val="none"/>
+        </w:rPr>
+        <w:t xml:space="preserve"> </w:t>
+      </w:r>
       <w:r>
         <w:rPr>
           <w:rFonts w:ascii="Times New Roman" w:eastAsia="Times New Roman" w:hAnsi="Times New Roman" w:cs="Times New Roman"/>
@@ -3625,17 +3471,6 @@
         </w:rPr>
         <w:t>The fix removes unsafe deserialization and enforces strict JSON parsing.</w:t>
       </w:r>
-    </w:p>
-    <w:p>
-      <w:pPr>
-        <w:spacing w:before="100" w:beforeAutospacing="1" w:after="100" w:afterAutospacing="1" w:line="240" w:lineRule="auto"/>
-        <w:rPr>
-          <w:rFonts w:ascii="Times New Roman" w:eastAsia="Times New Roman" w:hAnsi="Times New Roman" w:cs="Times New Roman"/>
-          <w:kern w:val="0"/>
-          <w:lang w:val="en-SA"/>
-          <w14:ligatures w14:val="none"/>
-        </w:rPr>
-      </w:pPr>
     </w:p>
     <w:p>
       <w:pPr>
@@ -3702,7 +3537,6 @@
           <w:lang w:val="en-SA"/>
           <w14:ligatures w14:val="none"/>
         </w:rPr>
-        <w:lastRenderedPageBreak/>
         <w:t>No custom errors appear in logs</w:t>
       </w:r>
     </w:p>
@@ -3738,7 +3572,392 @@
         </w:rPr>
       </w:pPr>
     </w:p>
+    <w:tbl>
+      <w:tblPr>
+        <w:tblStyle w:val="TableGrid"/>
+        <w:tblW w:w="0" w:type="auto"/>
+        <w:tblLook w:val="04A0" w:firstRow="1" w:lastRow="0" w:firstColumn="1" w:lastColumn="0" w:noHBand="0" w:noVBand="1"/>
+      </w:tblPr>
+      <w:tblGrid>
+        <w:gridCol w:w="1858"/>
+        <w:gridCol w:w="1846"/>
+        <w:gridCol w:w="1858"/>
+        <w:gridCol w:w="1847"/>
+        <w:gridCol w:w="1941"/>
+      </w:tblGrid>
+      <w:tr>
+        <w:tc>
+          <w:tcPr>
+            <w:tcW w:w="1870" w:type="dxa"/>
+          </w:tcPr>
+          <w:p/>
+        </w:tc>
+        <w:tc>
+          <w:tcPr>
+            <w:tcW w:w="1870" w:type="dxa"/>
+          </w:tcPr>
+          <w:p/>
+        </w:tc>
+        <w:tc>
+          <w:tcPr>
+            <w:tcW w:w="1870" w:type="dxa"/>
+          </w:tcPr>
+          <w:p/>
+        </w:tc>
+        <w:tc>
+          <w:tcPr>
+            <w:tcW w:w="1870" w:type="dxa"/>
+          </w:tcPr>
+          <w:p/>
+        </w:tc>
+        <w:tc>
+          <w:tcPr>
+            <w:tcW w:w="1870" w:type="dxa"/>
+          </w:tcPr>
+          <w:p/>
+        </w:tc>
+      </w:tr>
+      <w:tr>
+        <w:tc>
+          <w:tcPr>
+            <w:tcW w:w="1870" w:type="dxa"/>
+          </w:tcPr>
+          <w:p>
+            <w:r>
+              <w:t>Vulnerability</w:t>
+            </w:r>
+          </w:p>
+        </w:tc>
+        <w:tc>
+          <w:tcPr>
+            <w:tcW w:w="1870" w:type="dxa"/>
+          </w:tcPr>
+          <w:p>
+            <w:r>
+              <w:t>Intended Rule(s)</w:t>
+            </w:r>
+          </w:p>
+        </w:tc>
+        <w:tc>
+          <w:tcPr>
+            <w:tcW w:w="1870" w:type="dxa"/>
+          </w:tcPr>
+          <w:p>
+            <w:r>
+              <w:t>Artifacts Used to Infer Rule</w:t>
+            </w:r>
+          </w:p>
+        </w:tc>
+        <w:tc>
+          <w:tcPr>
+            <w:tcW w:w="1870" w:type="dxa"/>
+          </w:tcPr>
+          <w:p>
+            <w:r>
+              <w:t>Normal Behavior Evidence</w:t>
+            </w:r>
+          </w:p>
+        </w:tc>
+        <w:tc>
+          <w:tcPr>
+            <w:tcW w:w="1870" w:type="dxa"/>
+          </w:tcPr>
+          <w:p>
+            <w:r>
+              <w:t>Exploit Behavior Evidence</w:t>
+            </w:r>
+          </w:p>
+        </w:tc>
+      </w:tr>
+      <w:tr>
+        <w:tc>
+          <w:tcPr>
+            <w:tcW w:w="1870" w:type="dxa"/>
+          </w:tcPr>
+          <w:p>
+            <w:r>
+              <w:t>Event Injection</w:t>
+            </w:r>
+          </w:p>
+        </w:tc>
+        <w:tc>
+          <w:tcPr>
+            <w:tcW w:w="1870" w:type="dxa"/>
+          </w:tcPr>
+          <w:p>
+            <w:r>
+              <w:t>User input must be treated strictly as data and must never be executed as code</w:t>
+            </w:r>
+          </w:p>
+        </w:tc>
+        <w:tc>
+          <w:tcPr>
+            <w:tcW w:w="1870" w:type="dxa"/>
+          </w:tcPr>
+          <w:p>
+            <w:r>
+              <w:t>API requests (Postman), CloudWatch logs, Lambda source code</w:t>
+            </w:r>
+          </w:p>
+        </w:tc>
+        <w:tc>
+          <w:tcPr>
+            <w:tcW w:w="1870" w:type="dxa"/>
+          </w:tcPr>
+          <w:p>
+            <w:r>
+              <w:t>Valid request returns normal response</w:t>
+            </w:r>
+          </w:p>
+        </w:tc>
+        <w:tc>
+          <w:tcPr>
+            <w:tcW w:w="1870" w:type="dxa"/>
+          </w:tcPr>
+          <w:p>
+            <w:r>
+              <w:t>Injected payload executes and produces custom error in logs (</w:t>
+            </w:r>
+            <w:proofErr w:type="spellStart"/>
+            <w:r>
+              <w:t>INJECTEDbyMK</w:t>
+            </w:r>
+            <w:proofErr w:type="spellEnd"/>
+            <w:r>
+              <w:t>)</w:t>
+            </w:r>
+          </w:p>
+        </w:tc>
+      </w:tr>
+    </w:tbl>
     <w:p/>
+    <w:p/>
+    <w:p/>
+    <w:tbl>
+      <w:tblPr>
+        <w:tblStyle w:val="TableGrid"/>
+        <w:tblW w:w="0" w:type="auto"/>
+        <w:tblLook w:val="04A0" w:firstRow="1" w:lastRow="0" w:firstColumn="1" w:lastColumn="0" w:noHBand="0" w:noVBand="1"/>
+      </w:tblPr>
+      <w:tblGrid>
+        <w:gridCol w:w="1870"/>
+        <w:gridCol w:w="1870"/>
+        <w:gridCol w:w="1870"/>
+        <w:gridCol w:w="1870"/>
+        <w:gridCol w:w="1870"/>
+      </w:tblGrid>
+      <w:tr>
+        <w:tc>
+          <w:tcPr>
+            <w:tcW w:w="1870" w:type="dxa"/>
+          </w:tcPr>
+          <w:p>
+            <w:r>
+              <w:t>Vulnerability</w:t>
+            </w:r>
+          </w:p>
+        </w:tc>
+        <w:tc>
+          <w:tcPr>
+            <w:tcW w:w="1870" w:type="dxa"/>
+          </w:tcPr>
+          <w:p>
+            <w:r>
+              <w:t>Why This Is a Deviation</w:t>
+            </w:r>
+          </w:p>
+        </w:tc>
+        <w:tc>
+          <w:tcPr>
+            <w:tcW w:w="1870" w:type="dxa"/>
+          </w:tcPr>
+          <w:p>
+            <w:r>
+              <w:t>Deviation Class</w:t>
+            </w:r>
+          </w:p>
+        </w:tc>
+        <w:tc>
+          <w:tcPr>
+            <w:tcW w:w="1870" w:type="dxa"/>
+          </w:tcPr>
+          <w:p>
+            <w:r>
+              <w:t>Fix Applied (Where)</w:t>
+            </w:r>
+          </w:p>
+        </w:tc>
+        <w:tc>
+          <w:tcPr>
+            <w:tcW w:w="1870" w:type="dxa"/>
+          </w:tcPr>
+          <w:p>
+            <w:r>
+              <w:t>Post-Fix Verification</w:t>
+            </w:r>
+          </w:p>
+        </w:tc>
+      </w:tr>
+      <w:tr>
+        <w:tc>
+          <w:tcPr>
+            <w:tcW w:w="1870" w:type="dxa"/>
+          </w:tcPr>
+          <w:p>
+            <w:r>
+              <w:t>Event Injection</w:t>
+            </w:r>
+          </w:p>
+        </w:tc>
+        <w:tc>
+          <w:tcPr>
+            <w:tcW w:w="1870" w:type="dxa"/>
+          </w:tcPr>
+          <w:p>
+            <w:r>
+              <w:t>The system executes attacker-controlled input during deserialization, violating input-handling rules</w:t>
+            </w:r>
+          </w:p>
+        </w:tc>
+        <w:tc>
+          <w:tcPr>
+            <w:tcW w:w="1870" w:type="dxa"/>
+          </w:tcPr>
+          <w:p>
+            <w:r>
+              <w:t>Intentional misuse / security-relevant abuse</w:t>
+            </w:r>
+          </w:p>
+        </w:tc>
+        <w:tc>
+          <w:tcPr>
+            <w:tcW w:w="1870" w:type="dxa"/>
+          </w:tcPr>
+          <w:p>
+            <w:r>
+              <w:t>Removed node-serialize in Lambda request handler and replaced with JSON parsing</w:t>
+            </w:r>
+          </w:p>
+        </w:tc>
+        <w:tc>
+          <w:tcPr>
+            <w:tcW w:w="1870" w:type="dxa"/>
+          </w:tcPr>
+          <w:p>
+            <w:r>
+              <w:t>Payload no longer executes; system behaves normally after fix</w:t>
+            </w:r>
+          </w:p>
+        </w:tc>
+      </w:tr>
+    </w:tbl>
+    <w:p/>
+    <w:p/>
+    <w:p/>
+    <w:p>
+      <w:pPr>
+        <w:spacing w:before="100" w:beforeAutospacing="1" w:after="100" w:afterAutospacing="1" w:line="240" w:lineRule="auto"/>
+        <w:jc w:val="center"/>
+        <w:outlineLvl w:val="1"/>
+        <w:rPr>
+          <w:rFonts w:ascii="Times New Roman" w:eastAsia="Times New Roman" w:hAnsi="Times New Roman" w:cs="Times New Roman"/>
+          <w:b/>
+          <w:bCs/>
+          <w:i/>
+          <w:iCs/>
+          <w:kern w:val="0"/>
+          <w:sz w:val="36"/>
+          <w:szCs w:val="36"/>
+          <w:lang w:val="en-SA"/>
+          <w14:ligatures w14:val="none"/>
+        </w:rPr>
+      </w:pPr>
+      <w:r>
+        <w:rPr>
+          <w:rFonts w:ascii="Times New Roman" w:eastAsia="Times New Roman" w:hAnsi="Times New Roman" w:cs="Times New Roman"/>
+          <w:b/>
+          <w:bCs/>
+          <w:i/>
+          <w:iCs/>
+          <w:kern w:val="0"/>
+          <w:sz w:val="36"/>
+          <w:szCs w:val="36"/>
+          <w:lang w:val="en-SA"/>
+          <w14:ligatures w14:val="none"/>
+        </w:rPr>
+        <w:lastRenderedPageBreak/>
+        <w:t>Takeaway / Lessons Learned</w:t>
+      </w:r>
+    </w:p>
+    <w:p>
+      <w:pPr>
+        <w:spacing w:before="100" w:beforeAutospacing="1" w:after="100" w:afterAutospacing="1" w:line="240" w:lineRule="auto"/>
+        <w:rPr>
+          <w:rFonts w:ascii="Times New Roman" w:eastAsia="Times New Roman" w:hAnsi="Times New Roman" w:cs="Times New Roman"/>
+          <w:kern w:val="0"/>
+          <w:lang w:val="en-SA"/>
+          <w14:ligatures w14:val="none"/>
+        </w:rPr>
+      </w:pPr>
+    </w:p>
+    <w:p>
+      <w:pPr>
+        <w:spacing w:before="100" w:beforeAutospacing="1" w:after="100" w:afterAutospacing="1" w:line="240" w:lineRule="auto"/>
+        <w:rPr>
+          <w:rFonts w:ascii="Times New Roman" w:eastAsia="Times New Roman" w:hAnsi="Times New Roman" w:cs="Times New Roman"/>
+          <w:kern w:val="0"/>
+          <w:lang w:val="en-SA"/>
+          <w14:ligatures w14:val="none"/>
+        </w:rPr>
+      </w:pPr>
+      <w:r>
+        <w:rPr>
+          <w:rFonts w:ascii="Times New Roman" w:eastAsia="Times New Roman" w:hAnsi="Times New Roman" w:cs="Times New Roman"/>
+          <w:kern w:val="0"/>
+          <w:lang w:val="en-SA"/>
+          <w14:ligatures w14:val="none"/>
+        </w:rPr>
+        <w:t>This lesson demonstrates how unsafe deserialization can introduce critical vulnerabilities in serverless applications. By allowing user input to be interpreted as executable code, the system exposes itself to arbitrary code execution within the Lambda environment. This significantly increases the potential blast radius, as attackers may gain access to environment variables, internal services, or other AWS resources through the function’s execution role.</w:t>
+      </w:r>
+    </w:p>
+    <w:p>
+      <w:pPr>
+        <w:spacing w:before="100" w:beforeAutospacing="1" w:after="100" w:afterAutospacing="1" w:line="240" w:lineRule="auto"/>
+        <w:rPr>
+          <w:rFonts w:ascii="Times New Roman" w:eastAsia="Times New Roman" w:hAnsi="Times New Roman" w:cs="Times New Roman"/>
+          <w:kern w:val="0"/>
+          <w:lang w:val="en-SA"/>
+          <w14:ligatures w14:val="none"/>
+        </w:rPr>
+      </w:pPr>
+    </w:p>
+    <w:p>
+      <w:pPr>
+        <w:spacing w:before="100" w:beforeAutospacing="1" w:after="100" w:afterAutospacing="1" w:line="240" w:lineRule="auto"/>
+        <w:rPr>
+          <w:rFonts w:ascii="Times New Roman" w:eastAsia="Times New Roman" w:hAnsi="Times New Roman" w:cs="Times New Roman"/>
+          <w:kern w:val="0"/>
+          <w:lang w:val="en-SA"/>
+          <w14:ligatures w14:val="none"/>
+        </w:rPr>
+      </w:pPr>
+      <w:r>
+        <w:rPr>
+          <w:rFonts w:ascii="Times New Roman" w:eastAsia="Times New Roman" w:hAnsi="Times New Roman" w:cs="Times New Roman"/>
+          <w:kern w:val="0"/>
+          <w:lang w:val="en-SA"/>
+          <w14:ligatures w14:val="none"/>
+        </w:rPr>
+        <w:t>The root cause highlights the importance of secure dependency management and strict input handling. Libraries that support dynamic execution should never be used on untrusted input. Instead, all request data must be treated strictly as data and validated using allowlists and safe parsing methods.</w:t>
+      </w:r>
+    </w:p>
+    <w:p>
+      <w:pPr>
+        <w:rPr>
+          <w:lang w:val="en-SA"/>
+        </w:rPr>
+      </w:pPr>
+    </w:p>
     <w:sectPr>
       <w:pgSz w:w="12240" w:h="15840"/>
       <w:pgMar w:top="1440" w:right="1440" w:bottom="1440" w:left="1440" w:header="708" w:footer="708" w:gutter="0"/>
@@ -5765,6 +5984,25 @@
       <w:lang w:val="en-US"/>
     </w:rPr>
   </w:style>
+  <w:style w:type="table" w:styleId="TableGrid">
+    <w:name w:val="Table Grid"/>
+    <w:basedOn w:val="TableNormal"/>
+    <w:uiPriority w:val="39"/>
+    <w:rsid w:val="007704F9"/>
+    <w:pPr>
+      <w:spacing w:after="0" w:line="240" w:lineRule="auto"/>
+    </w:pPr>
+    <w:tblPr>
+      <w:tblBorders>
+        <w:top w:val="single" w:sz="4" w:space="0" w:color="auto"/>
+        <w:left w:val="single" w:sz="4" w:space="0" w:color="auto"/>
+        <w:bottom w:val="single" w:sz="4" w:space="0" w:color="auto"/>
+        <w:right w:val="single" w:sz="4" w:space="0" w:color="auto"/>
+        <w:insideH w:val="single" w:sz="4" w:space="0" w:color="auto"/>
+        <w:insideV w:val="single" w:sz="4" w:space="0" w:color="auto"/>
+      </w:tblBorders>
+    </w:tblPr>
+  </w:style>
 </w:styles>
 </file>
 

</xml_diff>